<commit_message>
feat: complete lecture content on scheduling quality and disciplines
- Expanded "Lecture 4: Scheduling Disciplines" with classification, dynamic priority systems in UNIX, and key algorithms.
- Rewrote "Lecture 5: Scheduling Quality" with comprehensive explanations, real-world examples, and practical tasks.
- Added self-assessment tests for both lectures with 10 well-structured multiple-choice questions.
- Improved alignment with teaching goals and course consistency.
</commit_message>
<xml_diff>
--- a/public/labs/os/kmp-24/ЛР11_ОС_Інсталяція_та_налаштування_ОС.docx
+++ b/public/labs/os/kmp-24/ЛР11_ОС_Інсталяція_та_налаштування_ОС.docx
@@ -23,9 +23,3389 @@
         <w:pStyle w:val="FirstParagraph"/>
       </w:pPr>
       <w:r>
-        <w:t xml:space="preserve">Матеріал цієї теми готується.</w:t>
-      </w:r>
-    </w:p>
+        <w:rPr>
+          <w:b/>
+          <w:bCs/>
+        </w:rPr>
+        <w:t xml:space="preserve">Мета:</w:t>
+      </w:r>
+      <w:r>
+        <w:t xml:space="preserve"> </w:t>
+      </w:r>
+      <w:r>
+        <w:t xml:space="preserve">навчитися готувати носій і віртуальну машину до встановлення операційної системи, свідомо обирати схему завантаження та розмітку диска, виконувати інсталяцію й первинне налаштування, а також перевіряти результат засобами самої системи.</w:t>
+      </w:r>
+    </w:p>
+    <w:p>
+      <w:pPr>
+        <w:pStyle w:val="BodyText"/>
+      </w:pPr>
+      <w:r>
+        <w:rPr>
+          <w:b/>
+          <w:bCs/>
+        </w:rPr>
+        <w:t xml:space="preserve">Обладнання:</w:t>
+      </w:r>
+      <w:r>
+        <w:t xml:space="preserve"> </w:t>
+      </w:r>
+      <w:r>
+        <w:t xml:space="preserve">ПК або віртуальна машина (VirtualBox, Hyper-V, QEMU); інсталяційний образ Ubuntu 22.04+ або Windows 10/11; утиліта запису образу на носій; щонайменше 25 ГБ вільного місця й 4 ГБ оперативної пам’яті для гостьової системи.</w:t>
+      </w:r>
+    </w:p>
+    <w:p>
+      <w:pPr>
+        <w:pStyle w:val="BodyText"/>
+      </w:pPr>
+      <w:r>
+        <w:rPr>
+          <w:b/>
+          <w:bCs/>
+        </w:rPr>
+        <w:t xml:space="preserve">Тривалість:</w:t>
+      </w:r>
+      <w:r>
+        <w:t xml:space="preserve"> </w:t>
+      </w:r>
+      <w:r>
+        <w:t xml:space="preserve">4 академічні години.</w:t>
+      </w:r>
+    </w:p>
+    <w:p>
+      <w:pPr>
+        <w:pStyle w:val="BodyText"/>
+      </w:pPr>
+      <w:r>
+        <w:rPr>
+          <w:b/>
+          <w:bCs/>
+        </w:rPr>
+        <w:t xml:space="preserve">УВАГА. Розмітка диска знищує дані. Усі дії цієї роботи виконуються ВИКЛЮЧНО у віртуальній машині з окремим віртуальним диском. Категорично заборонено запускати інсталятор на фізичному комп’ютері аудиторії, змінювати розділи носія, з якого завантажено робочу систему, та виконувати запис образу на диск викладача. Перед початком переконайтеся, що в інсталяторі обрано саме віртуальний диск.</w:t>
+      </w:r>
+    </w:p>
+    <w:bookmarkStart w:id="14" w:name="теоретичні-відомості"/>
+    <w:p>
+      <w:pPr>
+        <w:pStyle w:val="Heading2"/>
+      </w:pPr>
+      <w:r>
+        <w:t xml:space="preserve">Теоретичні відомості</w:t>
+      </w:r>
+    </w:p>
+    <w:bookmarkStart w:id="9" w:name="дві-схеми-завантаження"/>
+    <w:p>
+      <w:pPr>
+        <w:pStyle w:val="Heading3"/>
+      </w:pPr>
+      <w:r>
+        <w:t xml:space="preserve">1 Дві схеми завантаження</w:t>
+      </w:r>
+    </w:p>
+    <w:p>
+      <w:pPr>
+        <w:pStyle w:val="FirstParagraph"/>
+      </w:pPr>
+      <w:r>
+        <w:t xml:space="preserve">Спосіб, у який мікропрограма материнської плати знаходить і запускає</w:t>
+      </w:r>
+      <w:r>
+        <w:t xml:space="preserve"> </w:t>
+      </w:r>
+      <w:r>
+        <w:t xml:space="preserve">завантажувач, визначає й допустиму розмітку диска.</w:t>
+      </w:r>
+    </w:p>
+    <w:p>
+      <w:pPr>
+        <w:pStyle w:val="TableCaption"/>
+      </w:pPr>
+      <w:r>
+        <w:t xml:space="preserve">Таблиця 1 — Порівняння схем завантаження</w:t>
+      </w:r>
+    </w:p>
+    <w:tbl>
+      <w:tblPr>
+        <w:tblStyle w:val="Table"/>
+        <w:tblW w:type="dxa" w:w="9637"/>
+        <w:tblLayout w:type="fixed"/>
+        <w:tblLook w:firstRow="1" w:lastRow="0" w:firstColumn="0" w:lastColumn="0" w:noHBand="0" w:noVBand="0" w:val="0020"/>
+      </w:tblPr>
+      <w:tblGrid>
+        <w:gridCol w:w="2409"/>
+        <w:gridCol w:w="3614"/>
+        <w:gridCol w:w="3614"/>
+      </w:tblGrid>
+      <w:tr>
+        <w:trPr>
+          <w:tblHeader w:val="on"/>
+        </w:trPr>
+        <w:tc>
+          <w:tcPr/>
+          <w:p>
+            <w:pPr>
+              <w:pStyle w:val="Compact"/>
+            </w:pPr>
+            <w:r>
+              <w:t xml:space="preserve">Ознака</w:t>
+            </w:r>
+          </w:p>
+        </w:tc>
+        <w:tc>
+          <w:tcPr/>
+          <w:p>
+            <w:pPr>
+              <w:pStyle w:val="Compact"/>
+            </w:pPr>
+            <w:r>
+              <w:t xml:space="preserve">BIOS + MBR</w:t>
+            </w:r>
+          </w:p>
+        </w:tc>
+        <w:tc>
+          <w:tcPr/>
+          <w:p>
+            <w:pPr>
+              <w:pStyle w:val="Compact"/>
+            </w:pPr>
+            <w:r>
+              <w:t xml:space="preserve">UEFI + GPT</w:t>
+            </w:r>
+          </w:p>
+        </w:tc>
+      </w:tr>
+      <w:tr>
+        <w:tc>
+          <w:tcPr/>
+          <w:p>
+            <w:pPr>
+              <w:pStyle w:val="Compact"/>
+            </w:pPr>
+            <w:r>
+              <w:t xml:space="preserve">Де лежить завантажувач</w:t>
+            </w:r>
+          </w:p>
+        </w:tc>
+        <w:tc>
+          <w:tcPr/>
+          <w:p>
+            <w:pPr>
+              <w:pStyle w:val="Compact"/>
+            </w:pPr>
+            <w:r>
+              <w:t xml:space="preserve">у першому секторі диска (446 байтів коду)</w:t>
+            </w:r>
+          </w:p>
+        </w:tc>
+        <w:tc>
+          <w:tcPr/>
+          <w:p>
+            <w:pPr>
+              <w:pStyle w:val="Compact"/>
+            </w:pPr>
+            <w:r>
+              <w:t xml:space="preserve">у файлі на розділі EFI</w:t>
+            </w:r>
+          </w:p>
+        </w:tc>
+      </w:tr>
+      <w:tr>
+        <w:tc>
+          <w:tcPr/>
+          <w:p>
+            <w:pPr>
+              <w:pStyle w:val="Compact"/>
+            </w:pPr>
+            <w:r>
+              <w:t xml:space="preserve">Максимальний розмір диска</w:t>
+            </w:r>
+          </w:p>
+        </w:tc>
+        <w:tc>
+          <w:tcPr/>
+          <w:p>
+            <w:pPr>
+              <w:pStyle w:val="Compact"/>
+            </w:pPr>
+            <w:r>
+              <w:t xml:space="preserve">2 ТБ</w:t>
+            </w:r>
+          </w:p>
+        </w:tc>
+        <w:tc>
+          <w:tcPr/>
+          <w:p>
+            <w:pPr>
+              <w:pStyle w:val="Compact"/>
+            </w:pPr>
+            <w:r>
+              <w:t xml:space="preserve">9,4 ЗБ (практично без обмежень)</w:t>
+            </w:r>
+          </w:p>
+        </w:tc>
+      </w:tr>
+      <w:tr>
+        <w:tc>
+          <w:tcPr/>
+          <w:p>
+            <w:pPr>
+              <w:pStyle w:val="Compact"/>
+            </w:pPr>
+            <w:r>
+              <w:t xml:space="preserve">Кількість основних розділів</w:t>
+            </w:r>
+          </w:p>
+        </w:tc>
+        <w:tc>
+          <w:tcPr/>
+          <w:p>
+            <w:pPr>
+              <w:pStyle w:val="Compact"/>
+            </w:pPr>
+            <w:r>
+              <w:t xml:space="preserve">4 (більше — через розширений)</w:t>
+            </w:r>
+          </w:p>
+        </w:tc>
+        <w:tc>
+          <w:tcPr/>
+          <w:p>
+            <w:pPr>
+              <w:pStyle w:val="Compact"/>
+            </w:pPr>
+            <w:r>
+              <w:t xml:space="preserve">128 і більше</w:t>
+            </w:r>
+          </w:p>
+        </w:tc>
+      </w:tr>
+      <w:tr>
+        <w:tc>
+          <w:tcPr/>
+          <w:p>
+            <w:pPr>
+              <w:pStyle w:val="Compact"/>
+            </w:pPr>
+            <w:r>
+              <w:t xml:space="preserve">Резервна копія таблиці</w:t>
+            </w:r>
+          </w:p>
+        </w:tc>
+        <w:tc>
+          <w:tcPr/>
+          <w:p>
+            <w:pPr>
+              <w:pStyle w:val="Compact"/>
+            </w:pPr>
+            <w:r>
+              <w:t xml:space="preserve">немає</w:t>
+            </w:r>
+          </w:p>
+        </w:tc>
+        <w:tc>
+          <w:tcPr/>
+          <w:p>
+            <w:pPr>
+              <w:pStyle w:val="Compact"/>
+            </w:pPr>
+            <w:r>
+              <w:t xml:space="preserve">є, у кінці диска</w:t>
+            </w:r>
+          </w:p>
+        </w:tc>
+      </w:tr>
+      <w:tr>
+        <w:tc>
+          <w:tcPr/>
+          <w:p>
+            <w:pPr>
+              <w:pStyle w:val="Compact"/>
+            </w:pPr>
+            <w:r>
+              <w:t xml:space="preserve">Перевірка підпису завантажувача</w:t>
+            </w:r>
+          </w:p>
+        </w:tc>
+        <w:tc>
+          <w:tcPr/>
+          <w:p>
+            <w:pPr>
+              <w:pStyle w:val="Compact"/>
+            </w:pPr>
+            <w:r>
+              <w:t xml:space="preserve">немає</w:t>
+            </w:r>
+          </w:p>
+        </w:tc>
+        <w:tc>
+          <w:tcPr/>
+          <w:p>
+            <w:pPr>
+              <w:pStyle w:val="Compact"/>
+            </w:pPr>
+            <w:r>
+              <w:t xml:space="preserve">Secure Boot</w:t>
+            </w:r>
+          </w:p>
+        </w:tc>
+      </w:tr>
+      <w:tr>
+        <w:tc>
+          <w:tcPr/>
+          <w:p>
+            <w:pPr>
+              <w:pStyle w:val="Compact"/>
+            </w:pPr>
+            <w:r>
+              <w:t xml:space="preserve">Статус</w:t>
+            </w:r>
+          </w:p>
+        </w:tc>
+        <w:tc>
+          <w:tcPr/>
+          <w:p>
+            <w:pPr>
+              <w:pStyle w:val="Compact"/>
+            </w:pPr>
+            <w:r>
+              <w:t xml:space="preserve">застаріла</w:t>
+            </w:r>
+          </w:p>
+        </w:tc>
+        <w:tc>
+          <w:tcPr/>
+          <w:p>
+            <w:pPr>
+              <w:pStyle w:val="Compact"/>
+            </w:pPr>
+            <w:r>
+              <w:t xml:space="preserve">стандарт із 2010-х</w:t>
+            </w:r>
+          </w:p>
+        </w:tc>
+      </w:tr>
+    </w:tbl>
+    <w:p>
+      <w:pPr>
+        <w:pStyle w:val="BodyText"/>
+      </w:pPr>
+      <w:r>
+        <w:t xml:space="preserve">Головний практичний висновок: на UEFI-системі потрібен окремий розділ EFI</w:t>
+      </w:r>
+      <w:r>
+        <w:t xml:space="preserve"> </w:t>
+      </w:r>
+      <w:r>
+        <w:t xml:space="preserve">(ESP) з файловою системою FAT32, і без нього система не завантажиться, навіть</w:t>
+      </w:r>
+      <w:r>
+        <w:t xml:space="preserve"> </w:t>
+      </w:r>
+      <w:r>
+        <w:t xml:space="preserve">якщо інсталяція формально завершилася.</w:t>
+      </w:r>
+    </w:p>
+    <w:bookmarkEnd w:id="9"/>
+    <w:bookmarkStart w:id="10" w:name="розмітка-диска"/>
+    <w:p>
+      <w:pPr>
+        <w:pStyle w:val="Heading3"/>
+      </w:pPr>
+      <w:r>
+        <w:t xml:space="preserve">2 Розмітка диска</w:t>
+      </w:r>
+    </w:p>
+    <w:p>
+      <w:pPr>
+        <w:pStyle w:val="FirstParagraph"/>
+      </w:pPr>
+      <w:r>
+        <w:t xml:space="preserve">Розмітка — це поділ фізичного носія на логічні частини з окремими файловими</w:t>
+      </w:r>
+      <w:r>
+        <w:t xml:space="preserve"> </w:t>
+      </w:r>
+      <w:r>
+        <w:t xml:space="preserve">системами. Мінімальна робоча схема для Linux на UEFI:</w:t>
+      </w:r>
+    </w:p>
+    <w:p>
+      <w:pPr>
+        <w:pStyle w:val="TableCaption"/>
+      </w:pPr>
+      <w:r>
+        <w:t xml:space="preserve">Таблиця 2 — Типова схема розмітки диска 25 ГБ</w:t>
+      </w:r>
+    </w:p>
+    <w:tbl>
+      <w:tblPr>
+        <w:tblStyle w:val="Table"/>
+        <w:tblW w:type="dxa" w:w="9637"/>
+        <w:tblLook w:firstRow="1" w:lastRow="0" w:firstColumn="0" w:lastColumn="0" w:noHBand="0" w:noVBand="0" w:val="0020"/>
+        <w:tblLayout w:type="fixed"/>
+      </w:tblPr>
+      <w:tblGrid>
+        <w:gridCol w:w="1927"/>
+        <w:gridCol w:w="1927"/>
+        <w:gridCol w:w="1927"/>
+        <w:gridCol w:w="1927"/>
+        <w:gridCol w:w="1929"/>
+      </w:tblGrid>
+      <w:tr>
+        <w:trPr>
+          <w:tblHeader w:val="on"/>
+        </w:trPr>
+        <w:tc>
+          <w:tcPr/>
+          <w:p>
+            <w:pPr>
+              <w:pStyle w:val="Compact"/>
+            </w:pPr>
+            <w:r>
+              <w:t xml:space="preserve">Розділ</w:t>
+            </w:r>
+          </w:p>
+        </w:tc>
+        <w:tc>
+          <w:tcPr/>
+          <w:p>
+            <w:pPr>
+              <w:pStyle w:val="Compact"/>
+            </w:pPr>
+            <w:r>
+              <w:t xml:space="preserve">Розмір</w:t>
+            </w:r>
+          </w:p>
+        </w:tc>
+        <w:tc>
+          <w:tcPr/>
+          <w:p>
+            <w:pPr>
+              <w:pStyle w:val="Compact"/>
+            </w:pPr>
+            <w:r>
+              <w:t xml:space="preserve">Файлова система</w:t>
+            </w:r>
+          </w:p>
+        </w:tc>
+        <w:tc>
+          <w:tcPr/>
+          <w:p>
+            <w:pPr>
+              <w:pStyle w:val="Compact"/>
+            </w:pPr>
+            <w:r>
+              <w:t xml:space="preserve">Точка монтування</w:t>
+            </w:r>
+          </w:p>
+        </w:tc>
+        <w:tc>
+          <w:tcPr/>
+          <w:p>
+            <w:pPr>
+              <w:pStyle w:val="Compact"/>
+            </w:pPr>
+            <w:r>
+              <w:t xml:space="preserve">Призначення</w:t>
+            </w:r>
+          </w:p>
+        </w:tc>
+      </w:tr>
+      <w:tr>
+        <w:tc>
+          <w:tcPr/>
+          <w:p>
+            <w:pPr>
+              <w:pStyle w:val="Compact"/>
+            </w:pPr>
+            <w:r>
+              <w:t xml:space="preserve">EFI (ESP)</w:t>
+            </w:r>
+          </w:p>
+        </w:tc>
+        <w:tc>
+          <w:tcPr/>
+          <w:p>
+            <w:pPr>
+              <w:pStyle w:val="Compact"/>
+            </w:pPr>
+            <w:r>
+              <w:t xml:space="preserve">512 МБ</w:t>
+            </w:r>
+          </w:p>
+        </w:tc>
+        <w:tc>
+          <w:tcPr/>
+          <w:p>
+            <w:pPr>
+              <w:pStyle w:val="Compact"/>
+            </w:pPr>
+            <w:r>
+              <w:t xml:space="preserve">FAT32</w:t>
+            </w:r>
+          </w:p>
+        </w:tc>
+        <w:tc>
+          <w:tcPr/>
+          <w:p>
+            <w:pPr>
+              <w:pStyle w:val="Compact"/>
+            </w:pPr>
+            <w:r>
+              <w:rPr>
+                <w:rStyle w:val="VerbatimChar"/>
+              </w:rPr>
+              <w:t xml:space="preserve">/boot/efi</w:t>
+            </w:r>
+          </w:p>
+        </w:tc>
+        <w:tc>
+          <w:tcPr/>
+          <w:p>
+            <w:pPr>
+              <w:pStyle w:val="Compact"/>
+            </w:pPr>
+            <w:r>
+              <w:t xml:space="preserve">завантажувач</w:t>
+            </w:r>
+          </w:p>
+        </w:tc>
+      </w:tr>
+      <w:tr>
+        <w:tc>
+          <w:tcPr/>
+          <w:p>
+            <w:pPr>
+              <w:pStyle w:val="Compact"/>
+            </w:pPr>
+            <w:r>
+              <w:t xml:space="preserve">Кореневий</w:t>
+            </w:r>
+          </w:p>
+        </w:tc>
+        <w:tc>
+          <w:tcPr/>
+          <w:p>
+            <w:pPr>
+              <w:pStyle w:val="Compact"/>
+            </w:pPr>
+            <w:r>
+              <w:t xml:space="preserve">15 ГБ</w:t>
+            </w:r>
+          </w:p>
+        </w:tc>
+        <w:tc>
+          <w:tcPr/>
+          <w:p>
+            <w:pPr>
+              <w:pStyle w:val="Compact"/>
+            </w:pPr>
+            <w:r>
+              <w:t xml:space="preserve">ext4</w:t>
+            </w:r>
+          </w:p>
+        </w:tc>
+        <w:tc>
+          <w:tcPr/>
+          <w:p>
+            <w:pPr>
+              <w:pStyle w:val="Compact"/>
+            </w:pPr>
+            <w:r>
+              <w:rPr>
+                <w:rStyle w:val="VerbatimChar"/>
+              </w:rPr>
+              <w:t xml:space="preserve">/</w:t>
+            </w:r>
+          </w:p>
+        </w:tc>
+        <w:tc>
+          <w:tcPr/>
+          <w:p>
+            <w:pPr>
+              <w:pStyle w:val="Compact"/>
+            </w:pPr>
+            <w:r>
+              <w:t xml:space="preserve">система й програми</w:t>
+            </w:r>
+          </w:p>
+        </w:tc>
+      </w:tr>
+      <w:tr>
+        <w:tc>
+          <w:tcPr/>
+          <w:p>
+            <w:pPr>
+              <w:pStyle w:val="Compact"/>
+            </w:pPr>
+            <w:r>
+              <w:t xml:space="preserve">Домашній</w:t>
+            </w:r>
+          </w:p>
+        </w:tc>
+        <w:tc>
+          <w:tcPr/>
+          <w:p>
+            <w:pPr>
+              <w:pStyle w:val="Compact"/>
+            </w:pPr>
+            <w:r>
+              <w:t xml:space="preserve">решта</w:t>
+            </w:r>
+          </w:p>
+        </w:tc>
+        <w:tc>
+          <w:tcPr/>
+          <w:p>
+            <w:pPr>
+              <w:pStyle w:val="Compact"/>
+            </w:pPr>
+            <w:r>
+              <w:t xml:space="preserve">ext4</w:t>
+            </w:r>
+          </w:p>
+        </w:tc>
+        <w:tc>
+          <w:tcPr/>
+          <w:p>
+            <w:pPr>
+              <w:pStyle w:val="Compact"/>
+            </w:pPr>
+            <w:r>
+              <w:rPr>
+                <w:rStyle w:val="VerbatimChar"/>
+              </w:rPr>
+              <w:t xml:space="preserve">/home</w:t>
+            </w:r>
+          </w:p>
+        </w:tc>
+        <w:tc>
+          <w:tcPr/>
+          <w:p>
+            <w:pPr>
+              <w:pStyle w:val="Compact"/>
+            </w:pPr>
+            <w:r>
+              <w:t xml:space="preserve">дані користувача</w:t>
+            </w:r>
+          </w:p>
+        </w:tc>
+      </w:tr>
+      <w:tr>
+        <w:tc>
+          <w:tcPr/>
+          <w:p>
+            <w:pPr>
+              <w:pStyle w:val="Compact"/>
+            </w:pPr>
+            <w:r>
+              <w:t xml:space="preserve">Підкачка</w:t>
+            </w:r>
+          </w:p>
+        </w:tc>
+        <w:tc>
+          <w:tcPr/>
+          <w:p>
+            <w:pPr>
+              <w:pStyle w:val="Compact"/>
+            </w:pPr>
+            <w:r>
+              <w:t xml:space="preserve">2 ГБ</w:t>
+            </w:r>
+          </w:p>
+        </w:tc>
+        <w:tc>
+          <w:tcPr/>
+          <w:p>
+            <w:pPr>
+              <w:pStyle w:val="Compact"/>
+            </w:pPr>
+            <w:r>
+              <w:t xml:space="preserve">swap</w:t>
+            </w:r>
+          </w:p>
+        </w:tc>
+        <w:tc>
+          <w:tcPr/>
+          <w:p>
+            <w:pPr>
+              <w:pStyle w:val="Compact"/>
+            </w:pPr>
+            <w:r>
+              <w:t xml:space="preserve">—</w:t>
+            </w:r>
+          </w:p>
+        </w:tc>
+        <w:tc>
+          <w:tcPr/>
+          <w:p>
+            <w:pPr>
+              <w:pStyle w:val="Compact"/>
+            </w:pPr>
+            <w:r>
+              <w:t xml:space="preserve">вивантаження сторінок</w:t>
+            </w:r>
+          </w:p>
+        </w:tc>
+      </w:tr>
+    </w:tbl>
+    <w:p>
+      <w:pPr>
+        <w:pStyle w:val="BodyText"/>
+      </w:pPr>
+      <w:r>
+        <w:rPr>
+          <w:b/>
+          <w:bCs/>
+        </w:rPr>
+        <w:t xml:space="preserve">Навіщо окремий</w:t>
+      </w:r>
+      <w:r>
+        <w:rPr>
+          <w:b/>
+          <w:bCs/>
+        </w:rPr>
+        <w:t xml:space="preserve"> </w:t>
+      </w:r>
+      <w:r>
+        <w:rPr>
+          <w:rStyle w:val="VerbatimChar"/>
+          <w:b/>
+          <w:bCs/>
+        </w:rPr>
+        <w:t xml:space="preserve">/home</w:t>
+      </w:r>
+      <w:r>
+        <w:rPr>
+          <w:b/>
+          <w:bCs/>
+        </w:rPr>
+        <w:t xml:space="preserve">.</w:t>
+      </w:r>
+      <w:r>
+        <w:t xml:space="preserve"> </w:t>
+      </w:r>
+      <w:r>
+        <w:t xml:space="preserve">При перевстановленні системи кореневий розділ</w:t>
+      </w:r>
+      <w:r>
+        <w:t xml:space="preserve"> </w:t>
+      </w:r>
+      <w:r>
+        <w:t xml:space="preserve">форматують, а домашній лишають — дані користувача переживають зміну версії або</w:t>
+      </w:r>
+      <w:r>
+        <w:t xml:space="preserve"> </w:t>
+      </w:r>
+      <w:r>
+        <w:t xml:space="preserve">навіть дистрибутива. Зворотний бік: розмір розділів фіксується наперед, і</w:t>
+      </w:r>
+      <w:r>
+        <w:t xml:space="preserve"> </w:t>
+      </w:r>
+      <w:r>
+        <w:t xml:space="preserve">помилка в оцінці виправляється лише зміною розмітки.</w:t>
+      </w:r>
+    </w:p>
+    <w:bookmarkEnd w:id="10"/>
+    <w:bookmarkStart w:id="11" w:name="файлові-системи"/>
+    <w:p>
+      <w:pPr>
+        <w:pStyle w:val="Heading3"/>
+      </w:pPr>
+      <w:r>
+        <w:t xml:space="preserve">3 Файлові системи</w:t>
+      </w:r>
+    </w:p>
+    <w:p>
+      <w:pPr>
+        <w:pStyle w:val="TableCaption"/>
+      </w:pPr>
+      <w:r>
+        <w:t xml:space="preserve">Таблиця 3 — Поширені файлові системи</w:t>
+      </w:r>
+    </w:p>
+    <w:tbl>
+      <w:tblPr>
+        <w:tblStyle w:val="Table"/>
+        <w:tblW w:type="dxa" w:w="9637"/>
+        <w:tblLayout w:type="fixed"/>
+        <w:tblLook w:firstRow="1" w:lastRow="0" w:firstColumn="0" w:lastColumn="0" w:noHBand="0" w:noVBand="0" w:val="0020"/>
+      </w:tblPr>
+      <w:tblGrid>
+        <w:gridCol w:w="2223"/>
+        <w:gridCol w:w="4201"/>
+        <w:gridCol w:w="3213"/>
+      </w:tblGrid>
+      <w:tr>
+        <w:trPr>
+          <w:tblHeader w:val="on"/>
+        </w:trPr>
+        <w:tc>
+          <w:tcPr/>
+          <w:p>
+            <w:pPr>
+              <w:pStyle w:val="Compact"/>
+            </w:pPr>
+            <w:r>
+              <w:t xml:space="preserve">Система</w:t>
+            </w:r>
+          </w:p>
+        </w:tc>
+        <w:tc>
+          <w:tcPr/>
+          <w:p>
+            <w:pPr>
+              <w:pStyle w:val="Compact"/>
+            </w:pPr>
+            <w:r>
+              <w:t xml:space="preserve">Де застосовують</w:t>
+            </w:r>
+          </w:p>
+        </w:tc>
+        <w:tc>
+          <w:tcPr/>
+          <w:p>
+            <w:pPr>
+              <w:pStyle w:val="Compact"/>
+            </w:pPr>
+            <w:r>
+              <w:t xml:space="preserve">Особливості</w:t>
+            </w:r>
+          </w:p>
+        </w:tc>
+      </w:tr>
+      <w:tr>
+        <w:tc>
+          <w:tcPr/>
+          <w:p>
+            <w:pPr>
+              <w:pStyle w:val="Compact"/>
+            </w:pPr>
+            <w:r>
+              <w:t xml:space="preserve">ext4</w:t>
+            </w:r>
+          </w:p>
+        </w:tc>
+        <w:tc>
+          <w:tcPr/>
+          <w:p>
+            <w:pPr>
+              <w:pStyle w:val="Compact"/>
+            </w:pPr>
+            <w:r>
+              <w:t xml:space="preserve">типовий вибір для Linux</w:t>
+            </w:r>
+          </w:p>
+        </w:tc>
+        <w:tc>
+          <w:tcPr/>
+          <w:p>
+            <w:pPr>
+              <w:pStyle w:val="Compact"/>
+            </w:pPr>
+            <w:r>
+              <w:t xml:space="preserve">журналювання, стабільність, простота</w:t>
+            </w:r>
+          </w:p>
+        </w:tc>
+      </w:tr>
+      <w:tr>
+        <w:tc>
+          <w:tcPr/>
+          <w:p>
+            <w:pPr>
+              <w:pStyle w:val="Compact"/>
+            </w:pPr>
+            <w:r>
+              <w:t xml:space="preserve">Btrfs</w:t>
+            </w:r>
+          </w:p>
+        </w:tc>
+        <w:tc>
+          <w:tcPr/>
+          <w:p>
+            <w:pPr>
+              <w:pStyle w:val="Compact"/>
+            </w:pPr>
+            <w:r>
+              <w:t xml:space="preserve">Linux, де потрібні знімки</w:t>
+            </w:r>
+          </w:p>
+        </w:tc>
+        <w:tc>
+          <w:tcPr/>
+          <w:p>
+            <w:pPr>
+              <w:pStyle w:val="Compact"/>
+            </w:pPr>
+            <w:r>
+              <w:t xml:space="preserve">знімки стану, стиснення, перевірка цілісності</w:t>
+            </w:r>
+          </w:p>
+        </w:tc>
+      </w:tr>
+      <w:tr>
+        <w:tc>
+          <w:tcPr/>
+          <w:p>
+            <w:pPr>
+              <w:pStyle w:val="Compact"/>
+            </w:pPr>
+            <w:r>
+              <w:t xml:space="preserve">XFS</w:t>
+            </w:r>
+          </w:p>
+        </w:tc>
+        <w:tc>
+          <w:tcPr/>
+          <w:p>
+            <w:pPr>
+              <w:pStyle w:val="Compact"/>
+            </w:pPr>
+            <w:r>
+              <w:t xml:space="preserve">великі файли, сервери</w:t>
+            </w:r>
+          </w:p>
+        </w:tc>
+        <w:tc>
+          <w:tcPr/>
+          <w:p>
+            <w:pPr>
+              <w:pStyle w:val="Compact"/>
+            </w:pPr>
+            <w:r>
+              <w:t xml:space="preserve">добре працює з великими обсягами</w:t>
+            </w:r>
+          </w:p>
+        </w:tc>
+      </w:tr>
+      <w:tr>
+        <w:tc>
+          <w:tcPr/>
+          <w:p>
+            <w:pPr>
+              <w:pStyle w:val="Compact"/>
+            </w:pPr>
+            <w:r>
+              <w:t xml:space="preserve">NTFS</w:t>
+            </w:r>
+          </w:p>
+        </w:tc>
+        <w:tc>
+          <w:tcPr/>
+          <w:p>
+            <w:pPr>
+              <w:pStyle w:val="Compact"/>
+            </w:pPr>
+            <w:r>
+              <w:t xml:space="preserve">Windows</w:t>
+            </w:r>
+          </w:p>
+        </w:tc>
+        <w:tc>
+          <w:tcPr/>
+          <w:p>
+            <w:pPr>
+              <w:pStyle w:val="Compact"/>
+            </w:pPr>
+            <w:r>
+              <w:t xml:space="preserve">журналювання, ACL, стиснення</w:t>
+            </w:r>
+          </w:p>
+        </w:tc>
+      </w:tr>
+      <w:tr>
+        <w:tc>
+          <w:tcPr/>
+          <w:p>
+            <w:pPr>
+              <w:pStyle w:val="Compact"/>
+            </w:pPr>
+            <w:r>
+              <w:t xml:space="preserve">FAT32</w:t>
+            </w:r>
+          </w:p>
+        </w:tc>
+        <w:tc>
+          <w:tcPr/>
+          <w:p>
+            <w:pPr>
+              <w:pStyle w:val="Compact"/>
+            </w:pPr>
+            <w:r>
+              <w:t xml:space="preserve">розділ EFI, змінні носії</w:t>
+            </w:r>
+          </w:p>
+        </w:tc>
+        <w:tc>
+          <w:tcPr/>
+          <w:p>
+            <w:pPr>
+              <w:pStyle w:val="Compact"/>
+            </w:pPr>
+            <w:r>
+              <w:t xml:space="preserve">читає будь-яка система, файл до 4 ГБ</w:t>
+            </w:r>
+          </w:p>
+        </w:tc>
+      </w:tr>
+    </w:tbl>
+    <w:bookmarkEnd w:id="11"/>
+    <w:bookmarkStart w:id="12" w:name="етапи-інсталяції"/>
+    <w:p>
+      <w:pPr>
+        <w:pStyle w:val="Heading3"/>
+      </w:pPr>
+      <w:r>
+        <w:t xml:space="preserve">4 Етапи інсталяції</w:t>
+      </w:r>
+    </w:p>
+    <w:p>
+      <w:pPr>
+        <w:pStyle w:val="SourceCode"/>
+      </w:pPr>
+      <w:r>
+        <w:rPr>
+          <w:rStyle w:val="VerbatimChar"/>
+        </w:rPr>
+        <w:t xml:space="preserve">1. Завантаження з носія    → вибір режиму (UEFI чи Legacy) у меню</w:t>
+      </w:r>
+      <w:r>
+        <w:br/>
+      </w:r>
+      <w:r>
+        <w:rPr>
+          <w:rStyle w:val="VerbatimChar"/>
+        </w:rPr>
+        <w:t xml:space="preserve">2. Мова, розкладка, часовий пояс</w:t>
+      </w:r>
+      <w:r>
+        <w:br/>
+      </w:r>
+      <w:r>
+        <w:rPr>
+          <w:rStyle w:val="VerbatimChar"/>
+        </w:rPr>
+        <w:t xml:space="preserve">3. Тип встановлення         → розмітка: автоматична чи ручна</w:t>
+      </w:r>
+      <w:r>
+        <w:br/>
+      </w:r>
+      <w:r>
+        <w:rPr>
+          <w:rStyle w:val="VerbatimChar"/>
+        </w:rPr>
+        <w:t xml:space="preserve">4. Копіювання файлів        → розпакування образу на розділ</w:t>
+      </w:r>
+      <w:r>
+        <w:br/>
+      </w:r>
+      <w:r>
+        <w:rPr>
+          <w:rStyle w:val="VerbatimChar"/>
+        </w:rPr>
+        <w:t xml:space="preserve">5. Встановлення завантажувача → у ESP (UEFI) або MBR (BIOS)</w:t>
+      </w:r>
+      <w:r>
+        <w:br/>
+      </w:r>
+      <w:r>
+        <w:rPr>
+          <w:rStyle w:val="VerbatimChar"/>
+        </w:rPr>
+        <w:t xml:space="preserve">6. Створення користувача    → ім'я, пароль, назва комп'ютера</w:t>
+      </w:r>
+      <w:r>
+        <w:br/>
+      </w:r>
+      <w:r>
+        <w:rPr>
+          <w:rStyle w:val="VerbatimChar"/>
+        </w:rPr>
+        <w:t xml:space="preserve">7. Перезавантаження         → від'єднати образ, інакше інсталятор</w:t>
+      </w:r>
+      <w:r>
+        <w:br/>
+      </w:r>
+      <w:r>
+        <w:rPr>
+          <w:rStyle w:val="VerbatimChar"/>
+        </w:rPr>
+        <w:t xml:space="preserve">                              запуститься знову</w:t>
+      </w:r>
+    </w:p>
+    <w:bookmarkEnd w:id="12"/>
+    <w:bookmarkStart w:id="13" w:name="первинне-налаштування"/>
+    <w:p>
+      <w:pPr>
+        <w:pStyle w:val="Heading3"/>
+      </w:pPr>
+      <w:r>
+        <w:t xml:space="preserve">5 Первинне налаштування</w:t>
+      </w:r>
+    </w:p>
+    <w:p>
+      <w:pPr>
+        <w:pStyle w:val="FirstParagraph"/>
+      </w:pPr>
+      <w:r>
+        <w:t xml:space="preserve">Після першого входу система ще не готова до роботи. Обов’язковий мінімум:</w:t>
+      </w:r>
+    </w:p>
+    <w:p>
+      <w:pPr>
+        <w:pStyle w:val="Compact"/>
+        <w:numPr>
+          <w:ilvl w:val="0"/>
+          <w:numId w:val="1001"/>
+        </w:numPr>
+        <w:jc w:val="both"/>
+      </w:pPr>
+      <w:r>
+        <w:t xml:space="preserve">оновлення переліку пакетів і самих пакетів;</w:t>
+      </w:r>
+    </w:p>
+    <w:p>
+      <w:pPr>
+        <w:pStyle w:val="Compact"/>
+        <w:numPr>
+          <w:ilvl w:val="0"/>
+          <w:numId w:val="1001"/>
+        </w:numPr>
+        <w:jc w:val="both"/>
+      </w:pPr>
+      <w:r>
+        <w:t xml:space="preserve">перевірка мережі й часу;</w:t>
+      </w:r>
+    </w:p>
+    <w:p>
+      <w:pPr>
+        <w:pStyle w:val="Compact"/>
+        <w:numPr>
+          <w:ilvl w:val="0"/>
+          <w:numId w:val="1001"/>
+        </w:numPr>
+        <w:jc w:val="both"/>
+      </w:pPr>
+      <w:r>
+        <w:t xml:space="preserve">встановлення доповнень гостьової ОС (для віртуальної машини);</w:t>
+      </w:r>
+    </w:p>
+    <w:p>
+      <w:pPr>
+        <w:pStyle w:val="Compact"/>
+        <w:numPr>
+          <w:ilvl w:val="0"/>
+          <w:numId w:val="1001"/>
+        </w:numPr>
+        <w:jc w:val="both"/>
+      </w:pPr>
+      <w:r>
+        <w:t xml:space="preserve">перевірка розмітки й вільного місця;</w:t>
+      </w:r>
+    </w:p>
+    <w:p>
+      <w:pPr>
+        <w:pStyle w:val="Compact"/>
+        <w:numPr>
+          <w:ilvl w:val="0"/>
+          <w:numId w:val="1001"/>
+        </w:numPr>
+        <w:jc w:val="both"/>
+      </w:pPr>
+      <w:r>
+        <w:t xml:space="preserve">створення знімка стану (для віртуальної машини) — точка повернення.</w:t>
+      </w:r>
+    </w:p>
+    <w:bookmarkEnd w:id="13"/>
+    <w:bookmarkEnd w:id="14"/>
+    <w:bookmarkStart w:id="20" w:name="приклад-виконання"/>
+    <w:p>
+      <w:pPr>
+        <w:pStyle w:val="Heading2"/>
+      </w:pPr>
+      <w:r>
+        <w:t xml:space="preserve">Приклад виконання</w:t>
+      </w:r>
+    </w:p>
+    <w:bookmarkStart w:id="15" w:name="крок-1.-створення-віртуальної-машини"/>
+    <w:p>
+      <w:pPr>
+        <w:pStyle w:val="Heading3"/>
+      </w:pPr>
+      <w:r>
+        <w:t xml:space="preserve">Крок 1. Створення віртуальної машини</w:t>
+      </w:r>
+    </w:p>
+    <w:p>
+      <w:pPr>
+        <w:pStyle w:val="FirstParagraph"/>
+      </w:pPr>
+      <w:r>
+        <w:t xml:space="preserve">Параметри для Ubuntu: 2 ядра, 4096 МБ пам’яті, диск 25 ГБ, тип завантаження</w:t>
+      </w:r>
+      <w:r>
+        <w:t xml:space="preserve"> </w:t>
+      </w:r>
+      <w:r>
+        <w:t xml:space="preserve">UEFI, мережа NAT.</w:t>
+      </w:r>
+    </w:p>
+    <w:p>
+      <w:pPr>
+        <w:pStyle w:val="SourceCode"/>
+      </w:pPr>
+      <w:r>
+        <w:rPr>
+          <w:rStyle w:val="VerbatimChar"/>
+        </w:rPr>
+        <w:t xml:space="preserve"># Той самий результат командою (VirtualBox)</w:t>
+      </w:r>
+      <w:r>
+        <w:br/>
+      </w:r>
+      <w:r>
+        <w:rPr>
+          <w:rStyle w:val="VerbatimChar"/>
+        </w:rPr>
+        <w:t xml:space="preserve">VBoxManage createvm --name "lab11-ubuntu" --ostype Ubuntu_64 --register</w:t>
+      </w:r>
+      <w:r>
+        <w:br/>
+      </w:r>
+      <w:r>
+        <w:rPr>
+          <w:rStyle w:val="VerbatimChar"/>
+        </w:rPr>
+        <w:t xml:space="preserve">VBoxManage modifyvm "lab11-ubuntu" --memory 4096 --cpus 2 --firmware efi</w:t>
+      </w:r>
+      <w:r>
+        <w:br/>
+      </w:r>
+      <w:r>
+        <w:rPr>
+          <w:rStyle w:val="VerbatimChar"/>
+        </w:rPr>
+        <w:t xml:space="preserve">VBoxManage createhd --filename "lab11-ubuntu.vdi" --size 25600</w:t>
+      </w:r>
+      <w:r>
+        <w:br/>
+      </w:r>
+      <w:r>
+        <w:rPr>
+          <w:rStyle w:val="VerbatimChar"/>
+        </w:rPr>
+        <w:t xml:space="preserve">VBoxManage storagectl "lab11-ubuntu" --name "SATA" --add sata</w:t>
+      </w:r>
+      <w:r>
+        <w:br/>
+      </w:r>
+      <w:r>
+        <w:rPr>
+          <w:rStyle w:val="VerbatimChar"/>
+        </w:rPr>
+        <w:t xml:space="preserve">VBoxManage storageattach "lab11-ubuntu" --storagectl "SATA" --port 0 \</w:t>
+      </w:r>
+      <w:r>
+        <w:br/>
+      </w:r>
+      <w:r>
+        <w:rPr>
+          <w:rStyle w:val="VerbatimChar"/>
+        </w:rPr>
+        <w:t xml:space="preserve">  --device 0 --type hdd --medium "lab11-ubuntu.vdi"</w:t>
+      </w:r>
+    </w:p>
+    <w:p>
+      <w:pPr>
+        <w:pStyle w:val="FirstParagraph"/>
+      </w:pPr>
+      <w:r>
+        <w:t xml:space="preserve">Перевірка створеної машини:</w:t>
+      </w:r>
+    </w:p>
+    <w:p>
+      <w:pPr>
+        <w:pStyle w:val="SourceCode"/>
+      </w:pPr>
+      <w:r>
+        <w:rPr>
+          <w:rStyle w:val="VerbatimChar"/>
+        </w:rPr>
+        <w:t xml:space="preserve">VBoxManage showvminfo "lab11-ubuntu" | grep -E "Memory size|Firmware|Number of CPUs"</w:t>
+      </w:r>
+    </w:p>
+    <w:p>
+      <w:pPr>
+        <w:pStyle w:val="FirstParagraph"/>
+      </w:pPr>
+      <w:r>
+        <w:t xml:space="preserve">Вивід:</w:t>
+      </w:r>
+    </w:p>
+    <w:p>
+      <w:pPr>
+        <w:pStyle w:val="SourceCode"/>
+      </w:pPr>
+      <w:r>
+        <w:rPr>
+          <w:rStyle w:val="VerbatimChar"/>
+        </w:rPr>
+        <w:t xml:space="preserve">Memory size:     4096MB</w:t>
+      </w:r>
+      <w:r>
+        <w:br/>
+      </w:r>
+      <w:r>
+        <w:rPr>
+          <w:rStyle w:val="VerbatimChar"/>
+        </w:rPr>
+        <w:t xml:space="preserve">Number of CPUs:  2</w:t>
+      </w:r>
+      <w:r>
+        <w:br/>
+      </w:r>
+      <w:r>
+        <w:rPr>
+          <w:rStyle w:val="VerbatimChar"/>
+        </w:rPr>
+        <w:t xml:space="preserve">Firmware:        EFI</w:t>
+      </w:r>
+    </w:p>
+    <w:bookmarkEnd w:id="15"/>
+    <w:bookmarkStart w:id="16" w:name="крок-2.-ручна-розмітка-диска"/>
+    <w:p>
+      <w:pPr>
+        <w:pStyle w:val="Heading3"/>
+      </w:pPr>
+      <w:r>
+        <w:t xml:space="preserve">Крок 2. Ручна розмітка диска</w:t>
+      </w:r>
+    </w:p>
+    <w:p>
+      <w:pPr>
+        <w:pStyle w:val="FirstParagraph"/>
+      </w:pPr>
+      <w:r>
+        <w:t xml:space="preserve">В інсталяторі оберіть «Something else» (ручна розмітка) і створіть чотири</w:t>
+      </w:r>
+      <w:r>
+        <w:t xml:space="preserve"> </w:t>
+      </w:r>
+      <w:r>
+        <w:t xml:space="preserve">розділи за таблицею 2. Після встановлення перевірте результат:</w:t>
+      </w:r>
+    </w:p>
+    <w:p>
+      <w:pPr>
+        <w:pStyle w:val="SourceCode"/>
+      </w:pPr>
+      <w:r>
+        <w:rPr>
+          <w:rStyle w:val="VerbatimChar"/>
+        </w:rPr>
+        <w:t xml:space="preserve">lsblk -o NAME,SIZE,FSTYPE,MOUNTPOINT</w:t>
+      </w:r>
+    </w:p>
+    <w:p>
+      <w:pPr>
+        <w:pStyle w:val="FirstParagraph"/>
+      </w:pPr>
+      <w:r>
+        <w:t xml:space="preserve">Вивід:</w:t>
+      </w:r>
+    </w:p>
+    <w:p>
+      <w:pPr>
+        <w:pStyle w:val="SourceCode"/>
+      </w:pPr>
+      <w:r>
+        <w:rPr>
+          <w:rStyle w:val="VerbatimChar"/>
+        </w:rPr>
+        <w:t xml:space="preserve">NAME   SIZE FSTYPE MOUNTPOINT</w:t>
+      </w:r>
+      <w:r>
+        <w:br/>
+      </w:r>
+      <w:r>
+        <w:rPr>
+          <w:rStyle w:val="VerbatimChar"/>
+        </w:rPr>
+        <w:t xml:space="preserve">sda     25G</w:t>
+      </w:r>
+      <w:r>
+        <w:br/>
+      </w:r>
+      <w:r>
+        <w:rPr>
+          <w:rStyle w:val="VerbatimChar"/>
+        </w:rPr>
+        <w:t xml:space="preserve">├─sda1  512M vfat   /boot/efi</w:t>
+      </w:r>
+      <w:r>
+        <w:br/>
+      </w:r>
+      <w:r>
+        <w:rPr>
+          <w:rStyle w:val="VerbatimChar"/>
+        </w:rPr>
+        <w:t xml:space="preserve">├─sda2   15G ext4   /</w:t>
+      </w:r>
+      <w:r>
+        <w:br/>
+      </w:r>
+      <w:r>
+        <w:rPr>
+          <w:rStyle w:val="VerbatimChar"/>
+        </w:rPr>
+        <w:t xml:space="preserve">├─sda3  7.5G ext4   /home</w:t>
+      </w:r>
+      <w:r>
+        <w:br/>
+      </w:r>
+      <w:r>
+        <w:rPr>
+          <w:rStyle w:val="VerbatimChar"/>
+        </w:rPr>
+        <w:t xml:space="preserve">└─sda4    2G swap   [SWAP]</w:t>
+      </w:r>
+    </w:p>
+    <w:bookmarkEnd w:id="16"/>
+    <w:bookmarkStart w:id="17" w:name="крок-3.-перевірка-схеми-завантаження"/>
+    <w:p>
+      <w:pPr>
+        <w:pStyle w:val="Heading3"/>
+      </w:pPr>
+      <w:r>
+        <w:t xml:space="preserve">Крок 3. Перевірка схеми завантаження</w:t>
+      </w:r>
+    </w:p>
+    <w:p>
+      <w:pPr>
+        <w:pStyle w:val="SourceCode"/>
+      </w:pPr>
+      <w:r>
+        <w:rPr>
+          <w:rStyle w:val="VerbatimChar"/>
+        </w:rPr>
+        <w:t xml:space="preserve"># Якщо каталог існує — система завантажена в режимі UEFI</w:t>
+      </w:r>
+      <w:r>
+        <w:br/>
+      </w:r>
+      <w:r>
+        <w:rPr>
+          <w:rStyle w:val="VerbatimChar"/>
+        </w:rPr>
+        <w:t xml:space="preserve">ls /sys/firmware/efi &gt; /dev/null 2&gt;&amp;1 &amp;&amp; echo "UEFI" || echo "Legacy BIOS"</w:t>
+      </w:r>
+      <w:r>
+        <w:br/>
+      </w:r>
+      <w:r>
+        <w:br/>
+      </w:r>
+      <w:r>
+        <w:rPr>
+          <w:rStyle w:val="VerbatimChar"/>
+        </w:rPr>
+        <w:t xml:space="preserve"># Таблиця розділів: gpt чи dos</w:t>
+      </w:r>
+      <w:r>
+        <w:br/>
+      </w:r>
+      <w:r>
+        <w:rPr>
+          <w:rStyle w:val="VerbatimChar"/>
+        </w:rPr>
+        <w:t xml:space="preserve">sudo fdisk -l /dev/sda | grep "Disklabel type"</w:t>
+      </w:r>
+    </w:p>
+    <w:p>
+      <w:pPr>
+        <w:pStyle w:val="FirstParagraph"/>
+      </w:pPr>
+      <w:r>
+        <w:t xml:space="preserve">Вивід:</w:t>
+      </w:r>
+    </w:p>
+    <w:p>
+      <w:pPr>
+        <w:pStyle w:val="SourceCode"/>
+      </w:pPr>
+      <w:r>
+        <w:rPr>
+          <w:rStyle w:val="VerbatimChar"/>
+        </w:rPr>
+        <w:t xml:space="preserve">UEFI</w:t>
+      </w:r>
+      <w:r>
+        <w:br/>
+      </w:r>
+      <w:r>
+        <w:rPr>
+          <w:rStyle w:val="VerbatimChar"/>
+        </w:rPr>
+        <w:t xml:space="preserve">Disklabel type: gpt</w:t>
+      </w:r>
+    </w:p>
+    <w:p>
+      <w:pPr>
+        <w:pStyle w:val="FirstParagraph"/>
+      </w:pPr>
+      <w:r>
+        <w:t xml:space="preserve">Розбіжність між цими двома відповідями — типова помилка: система, встановлена</w:t>
+      </w:r>
+      <w:r>
+        <w:t xml:space="preserve"> </w:t>
+      </w:r>
+      <w:r>
+        <w:t xml:space="preserve">в режимі Legacy на диск GPT, або не завантажиться, або завантажиться лише з</w:t>
+      </w:r>
+      <w:r>
+        <w:t xml:space="preserve"> </w:t>
+      </w:r>
+      <w:r>
+        <w:t xml:space="preserve">конкретного меню.</w:t>
+      </w:r>
+    </w:p>
+    <w:bookmarkEnd w:id="17"/>
+    <w:bookmarkStart w:id="18" w:name="крок-4.-первинне-налаштування"/>
+    <w:p>
+      <w:pPr>
+        <w:pStyle w:val="Heading3"/>
+      </w:pPr>
+      <w:r>
+        <w:t xml:space="preserve">Крок 4. Первинне налаштування</w:t>
+      </w:r>
+    </w:p>
+    <w:p>
+      <w:pPr>
+        <w:pStyle w:val="SourceCode"/>
+      </w:pPr>
+      <w:r>
+        <w:rPr>
+          <w:rStyle w:val="VerbatimChar"/>
+        </w:rPr>
+        <w:t xml:space="preserve"># Оновлення переліку пакетів і самих пакетів</w:t>
+      </w:r>
+      <w:r>
+        <w:br/>
+      </w:r>
+      <w:r>
+        <w:rPr>
+          <w:rStyle w:val="VerbatimChar"/>
+        </w:rPr>
+        <w:t xml:space="preserve">sudo apt update &amp;&amp; sudo apt upgrade -y</w:t>
+      </w:r>
+      <w:r>
+        <w:br/>
+      </w:r>
+      <w:r>
+        <w:br/>
+      </w:r>
+      <w:r>
+        <w:rPr>
+          <w:rStyle w:val="VerbatimChar"/>
+        </w:rPr>
+        <w:t xml:space="preserve"># Часовий пояс і синхронізація часу</w:t>
+      </w:r>
+      <w:r>
+        <w:br/>
+      </w:r>
+      <w:r>
+        <w:rPr>
+          <w:rStyle w:val="VerbatimChar"/>
+        </w:rPr>
+        <w:t xml:space="preserve">timedatectl set-timezone Europe/Kyiv</w:t>
+      </w:r>
+      <w:r>
+        <w:br/>
+      </w:r>
+      <w:r>
+        <w:rPr>
+          <w:rStyle w:val="VerbatimChar"/>
+        </w:rPr>
+        <w:t xml:space="preserve">timedatectl status | head -4</w:t>
+      </w:r>
+      <w:r>
+        <w:br/>
+      </w:r>
+      <w:r>
+        <w:br/>
+      </w:r>
+      <w:r>
+        <w:rPr>
+          <w:rStyle w:val="VerbatimChar"/>
+        </w:rPr>
+        <w:t xml:space="preserve"># Перевірка мережі</w:t>
+      </w:r>
+      <w:r>
+        <w:br/>
+      </w:r>
+      <w:r>
+        <w:rPr>
+          <w:rStyle w:val="VerbatimChar"/>
+        </w:rPr>
+        <w:t xml:space="preserve">ip -brief address</w:t>
+      </w:r>
+      <w:r>
+        <w:br/>
+      </w:r>
+      <w:r>
+        <w:rPr>
+          <w:rStyle w:val="VerbatimChar"/>
+        </w:rPr>
+        <w:t xml:space="preserve">ping -c 2 8.8.8.8</w:t>
+      </w:r>
+    </w:p>
+    <w:bookmarkEnd w:id="18"/>
+    <w:bookmarkStart w:id="19" w:name="крок-5.-підсумкова-перевірка-системи"/>
+    <w:p>
+      <w:pPr>
+        <w:pStyle w:val="Heading3"/>
+      </w:pPr>
+      <w:r>
+        <w:t xml:space="preserve">Крок 5. Підсумкова перевірка системи</w:t>
+      </w:r>
+    </w:p>
+    <w:p>
+      <w:pPr>
+        <w:pStyle w:val="SourceCode"/>
+      </w:pPr>
+      <w:r>
+        <w:rPr>
+          <w:rStyle w:val="VerbatimChar"/>
+        </w:rPr>
+        <w:t xml:space="preserve"># Версія системи та ядра</w:t>
+      </w:r>
+      <w:r>
+        <w:br/>
+      </w:r>
+      <w:r>
+        <w:rPr>
+          <w:rStyle w:val="VerbatimChar"/>
+        </w:rPr>
+        <w:t xml:space="preserve">cat /etc/os-release | grep PRETTY_NAME</w:t>
+      </w:r>
+      <w:r>
+        <w:br/>
+      </w:r>
+      <w:r>
+        <w:rPr>
+          <w:rStyle w:val="VerbatimChar"/>
+        </w:rPr>
+        <w:t xml:space="preserve">uname -r</w:t>
+      </w:r>
+      <w:r>
+        <w:br/>
+      </w:r>
+      <w:r>
+        <w:br/>
+      </w:r>
+      <w:r>
+        <w:rPr>
+          <w:rStyle w:val="VerbatimChar"/>
+        </w:rPr>
+        <w:t xml:space="preserve"># Вільне місце на розділах</w:t>
+      </w:r>
+      <w:r>
+        <w:br/>
+      </w:r>
+      <w:r>
+        <w:rPr>
+          <w:rStyle w:val="VerbatimChar"/>
+        </w:rPr>
+        <w:t xml:space="preserve">df -h --output=source,size,used,avail,pcent,target | grep -E "^/dev"</w:t>
+      </w:r>
+      <w:r>
+        <w:br/>
+      </w:r>
+      <w:r>
+        <w:br/>
+      </w:r>
+      <w:r>
+        <w:rPr>
+          <w:rStyle w:val="VerbatimChar"/>
+        </w:rPr>
+        <w:t xml:space="preserve"># Підкачка активна?</w:t>
+      </w:r>
+      <w:r>
+        <w:br/>
+      </w:r>
+      <w:r>
+        <w:rPr>
+          <w:rStyle w:val="VerbatimChar"/>
+        </w:rPr>
+        <w:t xml:space="preserve">swapon --show</w:t>
+      </w:r>
+      <w:r>
+        <w:br/>
+      </w:r>
+      <w:r>
+        <w:br/>
+      </w:r>
+      <w:r>
+        <w:rPr>
+          <w:rStyle w:val="VerbatimChar"/>
+        </w:rPr>
+        <w:t xml:space="preserve"># Скільки часу тривало завантаження системи</w:t>
+      </w:r>
+      <w:r>
+        <w:br/>
+      </w:r>
+      <w:r>
+        <w:rPr>
+          <w:rStyle w:val="VerbatimChar"/>
+        </w:rPr>
+        <w:t xml:space="preserve">systemd-analyze</w:t>
+      </w:r>
+    </w:p>
+    <w:bookmarkEnd w:id="19"/>
+    <w:bookmarkEnd w:id="20"/>
+    <w:bookmarkStart w:id="21" w:name="порядок-виконання-роботи"/>
+    <w:p>
+      <w:pPr>
+        <w:pStyle w:val="Heading2"/>
+      </w:pPr>
+      <w:r>
+        <w:t xml:space="preserve">Порядок виконання роботи</w:t>
+      </w:r>
+    </w:p>
+    <w:p>
+      <w:pPr>
+        <w:pStyle w:val="Compact"/>
+        <w:numPr>
+          <w:ilvl w:val="0"/>
+          <w:numId w:val="1002"/>
+        </w:numPr>
+        <w:jc w:val="both"/>
+      </w:pPr>
+      <w:r>
+        <w:t xml:space="preserve">Отримати в викладача номер індивідуального варіанта.</w:t>
+      </w:r>
+    </w:p>
+    <w:p>
+      <w:pPr>
+        <w:pStyle w:val="Compact"/>
+        <w:numPr>
+          <w:ilvl w:val="0"/>
+          <w:numId w:val="1002"/>
+        </w:numPr>
+        <w:jc w:val="both"/>
+      </w:pPr>
+      <w:r>
+        <w:t xml:space="preserve">Створити віртуальну машину з параметрами свого варіанта.</w:t>
+      </w:r>
+    </w:p>
+    <w:p>
+      <w:pPr>
+        <w:pStyle w:val="Compact"/>
+        <w:numPr>
+          <w:ilvl w:val="0"/>
+          <w:numId w:val="1002"/>
+        </w:numPr>
+        <w:jc w:val="both"/>
+      </w:pPr>
+      <w:r>
+        <w:t xml:space="preserve">Під’єднати інсталяційний образ і завантажитися з нього у вказаному режимі</w:t>
+      </w:r>
+      <w:r>
+        <w:t xml:space="preserve"> </w:t>
+      </w:r>
+      <w:r>
+        <w:t xml:space="preserve">(UEFI або Legacy).</w:t>
+      </w:r>
+    </w:p>
+    <w:p>
+      <w:pPr>
+        <w:pStyle w:val="Compact"/>
+        <w:numPr>
+          <w:ilvl w:val="0"/>
+          <w:numId w:val="1002"/>
+        </w:numPr>
+        <w:jc w:val="both"/>
+      </w:pPr>
+      <w:r>
+        <w:t xml:space="preserve">Виконати</w:t>
+      </w:r>
+      <w:r>
+        <w:t xml:space="preserve"> </w:t>
+      </w:r>
+      <w:r>
+        <w:rPr>
+          <w:b/>
+          <w:bCs/>
+        </w:rPr>
+        <w:t xml:space="preserve">ручну</w:t>
+      </w:r>
+      <w:r>
+        <w:t xml:space="preserve"> </w:t>
+      </w:r>
+      <w:r>
+        <w:t xml:space="preserve">розмітку диска за схемою свого варіанта.</w:t>
+      </w:r>
+    </w:p>
+    <w:p>
+      <w:pPr>
+        <w:pStyle w:val="Compact"/>
+        <w:numPr>
+          <w:ilvl w:val="0"/>
+          <w:numId w:val="1002"/>
+        </w:numPr>
+        <w:jc w:val="both"/>
+      </w:pPr>
+      <w:r>
+        <w:t xml:space="preserve">Встановити систему, створити користувача з іменем за варіантом.</w:t>
+      </w:r>
+    </w:p>
+    <w:p>
+      <w:pPr>
+        <w:pStyle w:val="Compact"/>
+        <w:numPr>
+          <w:ilvl w:val="0"/>
+          <w:numId w:val="1002"/>
+        </w:numPr>
+        <w:jc w:val="both"/>
+      </w:pPr>
+      <w:r>
+        <w:t xml:space="preserve">Від’єднати образ і перезавантажитися в установлену систему.</w:t>
+      </w:r>
+    </w:p>
+    <w:p>
+      <w:pPr>
+        <w:pStyle w:val="Compact"/>
+        <w:numPr>
+          <w:ilvl w:val="0"/>
+          <w:numId w:val="1002"/>
+        </w:numPr>
+        <w:jc w:val="both"/>
+      </w:pPr>
+      <w:r>
+        <w:t xml:space="preserve">Виконати первинне налаштування: оновлення, часовий пояс, перевірка мережі.</w:t>
+      </w:r>
+    </w:p>
+    <w:p>
+      <w:pPr>
+        <w:pStyle w:val="Compact"/>
+        <w:numPr>
+          <w:ilvl w:val="0"/>
+          <w:numId w:val="1002"/>
+        </w:numPr>
+        <w:jc w:val="both"/>
+      </w:pPr>
+      <w:r>
+        <w:t xml:space="preserve">Виконати підсумкову перевірку (крок 5) і зберегти знімки екрана.</w:t>
+      </w:r>
+    </w:p>
+    <w:p>
+      <w:pPr>
+        <w:pStyle w:val="Compact"/>
+        <w:numPr>
+          <w:ilvl w:val="0"/>
+          <w:numId w:val="1002"/>
+        </w:numPr>
+        <w:jc w:val="both"/>
+      </w:pPr>
+      <w:r>
+        <w:t xml:space="preserve">Створити знімок стану віртуальної машини з назвою</w:t>
+      </w:r>
+      <w:r>
+        <w:t xml:space="preserve"> </w:t>
+      </w:r>
+      <w:r>
+        <w:rPr>
+          <w:rStyle w:val="VerbatimChar"/>
+        </w:rPr>
+        <w:t xml:space="preserve">after-install</w:t>
+      </w:r>
+      <w:r>
+        <w:t xml:space="preserve">.</w:t>
+      </w:r>
+    </w:p>
+    <w:p>
+      <w:pPr>
+        <w:pStyle w:val="Compact"/>
+        <w:numPr>
+          <w:ilvl w:val="0"/>
+          <w:numId w:val="1002"/>
+        </w:numPr>
+        <w:jc w:val="both"/>
+      </w:pPr>
+      <w:r>
+        <w:t xml:space="preserve">Оформити звіт і зробити висновок.</w:t>
+      </w:r>
+    </w:p>
+    <w:bookmarkEnd w:id="21"/>
+    <w:bookmarkStart w:id="22" w:name="вимоги-до-звіту"/>
+    <w:p>
+      <w:pPr>
+        <w:pStyle w:val="Heading2"/>
+      </w:pPr>
+      <w:r>
+        <w:t xml:space="preserve">Вимоги до звіту</w:t>
+      </w:r>
+    </w:p>
+    <w:p>
+      <w:pPr>
+        <w:pStyle w:val="FirstParagraph"/>
+      </w:pPr>
+      <w:r>
+        <w:t xml:space="preserve">Звіт оформлюється на бланку встановленого зразка і має містити:</w:t>
+      </w:r>
+    </w:p>
+    <w:p>
+      <w:pPr>
+        <w:pStyle w:val="Compact"/>
+        <w:numPr>
+          <w:ilvl w:val="0"/>
+          <w:numId w:val="1003"/>
+        </w:numPr>
+        <w:jc w:val="both"/>
+      </w:pPr>
+      <w:r>
+        <w:t xml:space="preserve">тему, мету та обладнання;</w:t>
+      </w:r>
+    </w:p>
+    <w:p>
+      <w:pPr>
+        <w:pStyle w:val="Compact"/>
+        <w:numPr>
+          <w:ilvl w:val="0"/>
+          <w:numId w:val="1003"/>
+        </w:numPr>
+        <w:jc w:val="both"/>
+      </w:pPr>
+      <w:r>
+        <w:t xml:space="preserve">параметри віртуальної машини за індивідуальним варіантом;</w:t>
+      </w:r>
+    </w:p>
+    <w:p>
+      <w:pPr>
+        <w:pStyle w:val="Compact"/>
+        <w:numPr>
+          <w:ilvl w:val="0"/>
+          <w:numId w:val="1003"/>
+        </w:numPr>
+        <w:jc w:val="both"/>
+      </w:pPr>
+      <w:r>
+        <w:t xml:space="preserve">таблицю розмітки: розділ, розмір, файлова система, точка монтування;</w:t>
+      </w:r>
+    </w:p>
+    <w:p>
+      <w:pPr>
+        <w:pStyle w:val="Compact"/>
+        <w:numPr>
+          <w:ilvl w:val="0"/>
+          <w:numId w:val="1003"/>
+        </w:numPr>
+        <w:jc w:val="both"/>
+      </w:pPr>
+      <w:r>
+        <w:t xml:space="preserve">знімки екрана: вікно розмітки, завершення інсталяції, вивід команд перевірки;</w:t>
+      </w:r>
+    </w:p>
+    <w:p>
+      <w:pPr>
+        <w:pStyle w:val="Compact"/>
+        <w:numPr>
+          <w:ilvl w:val="0"/>
+          <w:numId w:val="1003"/>
+        </w:numPr>
+        <w:jc w:val="both"/>
+      </w:pPr>
+      <w:r>
+        <w:t xml:space="preserve">перелік виконаних команд первинного налаштування з поясненням кожної;</w:t>
+      </w:r>
+    </w:p>
+    <w:p>
+      <w:pPr>
+        <w:pStyle w:val="Compact"/>
+        <w:numPr>
+          <w:ilvl w:val="0"/>
+          <w:numId w:val="1003"/>
+        </w:numPr>
+        <w:jc w:val="both"/>
+      </w:pPr>
+      <w:r>
+        <w:t xml:space="preserve">відповіді на контрольні запитання свого рівня;</w:t>
+      </w:r>
+    </w:p>
+    <w:p>
+      <w:pPr>
+        <w:pStyle w:val="Compact"/>
+        <w:numPr>
+          <w:ilvl w:val="0"/>
+          <w:numId w:val="1003"/>
+        </w:numPr>
+        <w:jc w:val="both"/>
+      </w:pPr>
+      <w:r>
+        <w:t xml:space="preserve">висновок за результатами роботи.</w:t>
+      </w:r>
+    </w:p>
+    <w:bookmarkEnd w:id="22"/>
+    <w:bookmarkStart w:id="23" w:name="варіанти-індивідуальних-завдань"/>
+    <w:p>
+      <w:pPr>
+        <w:pStyle w:val="Heading2"/>
+      </w:pPr>
+      <w:r>
+        <w:t xml:space="preserve">Варіанти індивідуальних завдань</w:t>
+      </w:r>
+    </w:p>
+    <w:tbl>
+      <w:tblPr>
+        <w:tblStyle w:val="Table"/>
+        <w:tblW w:type="dxa" w:w="9637"/>
+        <w:tblLayout w:type="fixed"/>
+        <w:tblLook w:firstRow="1" w:lastRow="0" w:firstColumn="0" w:lastColumn="0" w:noHBand="0" w:noVBand="0" w:val="0020"/>
+      </w:tblPr>
+      <w:tblGrid>
+        <w:gridCol w:w="506"/>
+        <w:gridCol w:w="3044"/>
+        <w:gridCol w:w="2706"/>
+        <w:gridCol w:w="3381"/>
+      </w:tblGrid>
+      <w:tr>
+        <w:trPr>
+          <w:tblHeader w:val="on"/>
+        </w:trPr>
+        <w:tc>
+          <w:tcPr/>
+          <w:p>
+            <w:pPr>
+              <w:pStyle w:val="Compact"/>
+            </w:pPr>
+            <w:r>
+              <w:t xml:space="preserve">№</w:t>
+            </w:r>
+          </w:p>
+        </w:tc>
+        <w:tc>
+          <w:tcPr/>
+          <w:p>
+            <w:pPr>
+              <w:pStyle w:val="Compact"/>
+            </w:pPr>
+            <w:r>
+              <w:t xml:space="preserve">Система та режим</w:t>
+            </w:r>
+          </w:p>
+        </w:tc>
+        <w:tc>
+          <w:tcPr/>
+          <w:p>
+            <w:pPr>
+              <w:pStyle w:val="Compact"/>
+            </w:pPr>
+            <w:r>
+              <w:t xml:space="preserve">Схема розмітки</w:t>
+            </w:r>
+          </w:p>
+        </w:tc>
+        <w:tc>
+          <w:tcPr/>
+          <w:p>
+            <w:pPr>
+              <w:pStyle w:val="Compact"/>
+            </w:pPr>
+            <w:r>
+              <w:t xml:space="preserve">Додаткове завдання</w:t>
+            </w:r>
+          </w:p>
+        </w:tc>
+      </w:tr>
+      <w:tr>
+        <w:tc>
+          <w:tcPr/>
+          <w:p>
+            <w:pPr>
+              <w:pStyle w:val="Compact"/>
+            </w:pPr>
+            <w:r>
+              <w:t xml:space="preserve">1</w:t>
+            </w:r>
+          </w:p>
+        </w:tc>
+        <w:tc>
+          <w:tcPr/>
+          <w:p>
+            <w:pPr>
+              <w:pStyle w:val="Compact"/>
+            </w:pPr>
+            <w:r>
+              <w:t xml:space="preserve">Ubuntu, UEFI</w:t>
+            </w:r>
+          </w:p>
+        </w:tc>
+        <w:tc>
+          <w:tcPr/>
+          <w:p>
+            <w:pPr>
+              <w:pStyle w:val="Compact"/>
+            </w:pPr>
+            <w:r>
+              <w:t xml:space="preserve">ESP 512M, / 15G, /home решта, swap 2G</w:t>
+            </w:r>
+          </w:p>
+        </w:tc>
+        <w:tc>
+          <w:tcPr/>
+          <w:p>
+            <w:pPr>
+              <w:pStyle w:val="Compact"/>
+            </w:pPr>
+            <w:r>
+              <w:t xml:space="preserve">Виміряти час завантаження</w:t>
+            </w:r>
+          </w:p>
+        </w:tc>
+      </w:tr>
+      <w:tr>
+        <w:tc>
+          <w:tcPr/>
+          <w:p>
+            <w:pPr>
+              <w:pStyle w:val="Compact"/>
+            </w:pPr>
+            <w:r>
+              <w:t xml:space="preserve">2</w:t>
+            </w:r>
+          </w:p>
+        </w:tc>
+        <w:tc>
+          <w:tcPr/>
+          <w:p>
+            <w:pPr>
+              <w:pStyle w:val="Compact"/>
+            </w:pPr>
+            <w:r>
+              <w:t xml:space="preserve">Ubuntu, UEFI</w:t>
+            </w:r>
+          </w:p>
+        </w:tc>
+        <w:tc>
+          <w:tcPr/>
+          <w:p>
+            <w:pPr>
+              <w:pStyle w:val="Compact"/>
+            </w:pPr>
+            <w:r>
+              <w:t xml:space="preserve">ESP 512M, / 20G, swap 2G, без /home</w:t>
+            </w:r>
+          </w:p>
+        </w:tc>
+        <w:tc>
+          <w:tcPr/>
+          <w:p>
+            <w:pPr>
+              <w:pStyle w:val="Compact"/>
+            </w:pPr>
+            <w:r>
+              <w:t xml:space="preserve">Порівняти з варіантом 1 за гнучкістю</w:t>
+            </w:r>
+          </w:p>
+        </w:tc>
+      </w:tr>
+      <w:tr>
+        <w:tc>
+          <w:tcPr/>
+          <w:p>
+            <w:pPr>
+              <w:pStyle w:val="Compact"/>
+            </w:pPr>
+            <w:r>
+              <w:t xml:space="preserve">3</w:t>
+            </w:r>
+          </w:p>
+        </w:tc>
+        <w:tc>
+          <w:tcPr/>
+          <w:p>
+            <w:pPr>
+              <w:pStyle w:val="Compact"/>
+            </w:pPr>
+            <w:r>
+              <w:t xml:space="preserve">Ubuntu, Legacy BIOS</w:t>
+            </w:r>
+          </w:p>
+        </w:tc>
+        <w:tc>
+          <w:tcPr/>
+          <w:p>
+            <w:pPr>
+              <w:pStyle w:val="Compact"/>
+            </w:pPr>
+            <w:r>
+              <w:t xml:space="preserve">/ 20G, swap 2G</w:t>
+            </w:r>
+          </w:p>
+        </w:tc>
+        <w:tc>
+          <w:tcPr/>
+          <w:p>
+            <w:pPr>
+              <w:pStyle w:val="Compact"/>
+            </w:pPr>
+            <w:r>
+              <w:t xml:space="preserve">Пояснити відсутність ESP</w:t>
+            </w:r>
+          </w:p>
+        </w:tc>
+      </w:tr>
+      <w:tr>
+        <w:tc>
+          <w:tcPr/>
+          <w:p>
+            <w:pPr>
+              <w:pStyle w:val="Compact"/>
+            </w:pPr>
+            <w:r>
+              <w:t xml:space="preserve">4</w:t>
+            </w:r>
+          </w:p>
+        </w:tc>
+        <w:tc>
+          <w:tcPr/>
+          <w:p>
+            <w:pPr>
+              <w:pStyle w:val="Compact"/>
+            </w:pPr>
+            <w:r>
+              <w:t xml:space="preserve">Debian, UEFI</w:t>
+            </w:r>
+          </w:p>
+        </w:tc>
+        <w:tc>
+          <w:tcPr/>
+          <w:p>
+            <w:pPr>
+              <w:pStyle w:val="Compact"/>
+            </w:pPr>
+            <w:r>
+              <w:t xml:space="preserve">ESP 512M, / 12G, /home 10G, swap 2G</w:t>
+            </w:r>
+          </w:p>
+        </w:tc>
+        <w:tc>
+          <w:tcPr/>
+          <w:p>
+            <w:pPr>
+              <w:pStyle w:val="Compact"/>
+            </w:pPr>
+            <w:r>
+              <w:t xml:space="preserve">Налаштувати статичну IP-адресу</w:t>
+            </w:r>
+          </w:p>
+        </w:tc>
+      </w:tr>
+      <w:tr>
+        <w:tc>
+          <w:tcPr/>
+          <w:p>
+            <w:pPr>
+              <w:pStyle w:val="Compact"/>
+            </w:pPr>
+            <w:r>
+              <w:t xml:space="preserve">5</w:t>
+            </w:r>
+          </w:p>
+        </w:tc>
+        <w:tc>
+          <w:tcPr/>
+          <w:p>
+            <w:pPr>
+              <w:pStyle w:val="Compact"/>
+            </w:pPr>
+            <w:r>
+              <w:t xml:space="preserve">Ubuntu Server, UEFI</w:t>
+            </w:r>
+          </w:p>
+        </w:tc>
+        <w:tc>
+          <w:tcPr/>
+          <w:p>
+            <w:pPr>
+              <w:pStyle w:val="Compact"/>
+            </w:pPr>
+            <w:r>
+              <w:t xml:space="preserve">ESP 512M, / 20G, swap 2G</w:t>
+            </w:r>
+          </w:p>
+        </w:tc>
+        <w:tc>
+          <w:tcPr/>
+          <w:p>
+            <w:pPr>
+              <w:pStyle w:val="Compact"/>
+            </w:pPr>
+            <w:r>
+              <w:t xml:space="preserve">Встановити без графічного середовища</w:t>
+            </w:r>
+          </w:p>
+        </w:tc>
+      </w:tr>
+      <w:tr>
+        <w:tc>
+          <w:tcPr/>
+          <w:p>
+            <w:pPr>
+              <w:pStyle w:val="Compact"/>
+            </w:pPr>
+            <w:r>
+              <w:t xml:space="preserve">6</w:t>
+            </w:r>
+          </w:p>
+        </w:tc>
+        <w:tc>
+          <w:tcPr/>
+          <w:p>
+            <w:pPr>
+              <w:pStyle w:val="Compact"/>
+            </w:pPr>
+            <w:r>
+              <w:t xml:space="preserve">Ubuntu, UEFI, Btrfs</w:t>
+            </w:r>
+          </w:p>
+        </w:tc>
+        <w:tc>
+          <w:tcPr/>
+          <w:p>
+            <w:pPr>
+              <w:pStyle w:val="Compact"/>
+            </w:pPr>
+            <w:r>
+              <w:t xml:space="preserve">ESP 512M, / 20G (Btrfs), swap 2G</w:t>
+            </w:r>
+          </w:p>
+        </w:tc>
+        <w:tc>
+          <w:tcPr/>
+          <w:p>
+            <w:pPr>
+              <w:pStyle w:val="Compact"/>
+            </w:pPr>
+            <w:r>
+              <w:t xml:space="preserve">Створити знімок підтому</w:t>
+            </w:r>
+          </w:p>
+        </w:tc>
+      </w:tr>
+      <w:tr>
+        <w:tc>
+          <w:tcPr/>
+          <w:p>
+            <w:pPr>
+              <w:pStyle w:val="Compact"/>
+            </w:pPr>
+            <w:r>
+              <w:t xml:space="preserve">7</w:t>
+            </w:r>
+          </w:p>
+        </w:tc>
+        <w:tc>
+          <w:tcPr/>
+          <w:p>
+            <w:pPr>
+              <w:pStyle w:val="Compact"/>
+            </w:pPr>
+            <w:r>
+              <w:t xml:space="preserve">Ubuntu, UEFI</w:t>
+            </w:r>
+          </w:p>
+        </w:tc>
+        <w:tc>
+          <w:tcPr/>
+          <w:p>
+            <w:pPr>
+              <w:pStyle w:val="Compact"/>
+            </w:pPr>
+            <w:r>
+              <w:t xml:space="preserve">ESP 512M, / 15G, /var 5G, swap 2G</w:t>
+            </w:r>
+          </w:p>
+        </w:tc>
+        <w:tc>
+          <w:tcPr/>
+          <w:p>
+            <w:pPr>
+              <w:pStyle w:val="Compact"/>
+            </w:pPr>
+            <w:r>
+              <w:t xml:space="preserve">Пояснити винесення /var</w:t>
+            </w:r>
+          </w:p>
+        </w:tc>
+      </w:tr>
+      <w:tr>
+        <w:tc>
+          <w:tcPr/>
+          <w:p>
+            <w:pPr>
+              <w:pStyle w:val="Compact"/>
+            </w:pPr>
+            <w:r>
+              <w:t xml:space="preserve">8</w:t>
+            </w:r>
+          </w:p>
+        </w:tc>
+        <w:tc>
+          <w:tcPr/>
+          <w:p>
+            <w:pPr>
+              <w:pStyle w:val="Compact"/>
+            </w:pPr>
+            <w:r>
+              <w:t xml:space="preserve">Fedora, UEFI</w:t>
+            </w:r>
+          </w:p>
+        </w:tc>
+        <w:tc>
+          <w:tcPr/>
+          <w:p>
+            <w:pPr>
+              <w:pStyle w:val="Compact"/>
+            </w:pPr>
+            <w:r>
+              <w:t xml:space="preserve">автоматична розмітка</w:t>
+            </w:r>
+          </w:p>
+        </w:tc>
+        <w:tc>
+          <w:tcPr/>
+          <w:p>
+            <w:pPr>
+              <w:pStyle w:val="Compact"/>
+            </w:pPr>
+            <w:r>
+              <w:t xml:space="preserve">Описати, що обрав інсталятор і чому</w:t>
+            </w:r>
+          </w:p>
+        </w:tc>
+      </w:tr>
+      <w:tr>
+        <w:tc>
+          <w:tcPr/>
+          <w:p>
+            <w:pPr>
+              <w:pStyle w:val="Compact"/>
+            </w:pPr>
+            <w:r>
+              <w:t xml:space="preserve">9</w:t>
+            </w:r>
+          </w:p>
+        </w:tc>
+        <w:tc>
+          <w:tcPr/>
+          <w:p>
+            <w:pPr>
+              <w:pStyle w:val="Compact"/>
+            </w:pPr>
+            <w:r>
+              <w:t xml:space="preserve">Windows 10/11, UEFI</w:t>
+            </w:r>
+          </w:p>
+        </w:tc>
+        <w:tc>
+          <w:tcPr/>
+          <w:p>
+            <w:pPr>
+              <w:pStyle w:val="Compact"/>
+            </w:pPr>
+            <w:r>
+              <w:t xml:space="preserve">автоматична розмітка</w:t>
+            </w:r>
+          </w:p>
+        </w:tc>
+        <w:tc>
+          <w:tcPr/>
+          <w:p>
+            <w:pPr>
+              <w:pStyle w:val="Compact"/>
+            </w:pPr>
+            <w:r>
+              <w:t xml:space="preserve">Перелічити створені розділи</w:t>
+            </w:r>
+          </w:p>
+        </w:tc>
+      </w:tr>
+      <w:tr>
+        <w:tc>
+          <w:tcPr/>
+          <w:p>
+            <w:pPr>
+              <w:pStyle w:val="Compact"/>
+            </w:pPr>
+            <w:r>
+              <w:t xml:space="preserve">10</w:t>
+            </w:r>
+          </w:p>
+        </w:tc>
+        <w:tc>
+          <w:tcPr/>
+          <w:p>
+            <w:pPr>
+              <w:pStyle w:val="Compact"/>
+            </w:pPr>
+            <w:r>
+              <w:t xml:space="preserve">Ubuntu, UEFI, XFS</w:t>
+            </w:r>
+          </w:p>
+        </w:tc>
+        <w:tc>
+          <w:tcPr/>
+          <w:p>
+            <w:pPr>
+              <w:pStyle w:val="Compact"/>
+            </w:pPr>
+            <w:r>
+              <w:t xml:space="preserve">ESP 512M, / 20G (XFS), swap 2G</w:t>
+            </w:r>
+          </w:p>
+        </w:tc>
+        <w:tc>
+          <w:tcPr/>
+          <w:p>
+            <w:pPr>
+              <w:pStyle w:val="Compact"/>
+            </w:pPr>
+            <w:r>
+              <w:t xml:space="preserve">Порівняти XFS та ext4</w:t>
+            </w:r>
+          </w:p>
+        </w:tc>
+      </w:tr>
+      <w:tr>
+        <w:tc>
+          <w:tcPr/>
+          <w:p>
+            <w:pPr>
+              <w:pStyle w:val="Compact"/>
+            </w:pPr>
+            <w:r>
+              <w:t xml:space="preserve">11</w:t>
+            </w:r>
+          </w:p>
+        </w:tc>
+        <w:tc>
+          <w:tcPr/>
+          <w:p>
+            <w:pPr>
+              <w:pStyle w:val="Compact"/>
+            </w:pPr>
+            <w:r>
+              <w:t xml:space="preserve">Ubuntu, UEFI</w:t>
+            </w:r>
+          </w:p>
+        </w:tc>
+        <w:tc>
+          <w:tcPr/>
+          <w:p>
+            <w:pPr>
+              <w:pStyle w:val="Compact"/>
+            </w:pPr>
+            <w:r>
+              <w:t xml:space="preserve">ESP 512M, / 15G, /home 8G, swap 1G</w:t>
+            </w:r>
+          </w:p>
+        </w:tc>
+        <w:tc>
+          <w:tcPr/>
+          <w:p>
+            <w:pPr>
+              <w:pStyle w:val="Compact"/>
+            </w:pPr>
+            <w:r>
+              <w:t xml:space="preserve">Перевірити поведінку за малої підкачки</w:t>
+            </w:r>
+          </w:p>
+        </w:tc>
+      </w:tr>
+      <w:tr>
+        <w:tc>
+          <w:tcPr/>
+          <w:p>
+            <w:pPr>
+              <w:pStyle w:val="Compact"/>
+            </w:pPr>
+            <w:r>
+              <w:t xml:space="preserve">12</w:t>
+            </w:r>
+          </w:p>
+        </w:tc>
+        <w:tc>
+          <w:tcPr/>
+          <w:p>
+            <w:pPr>
+              <w:pStyle w:val="Compact"/>
+            </w:pPr>
+            <w:r>
+              <w:t xml:space="preserve">Debian, Legacy BIOS</w:t>
+            </w:r>
+          </w:p>
+        </w:tc>
+        <w:tc>
+          <w:tcPr/>
+          <w:p>
+            <w:pPr>
+              <w:pStyle w:val="Compact"/>
+            </w:pPr>
+            <w:r>
+              <w:t xml:space="preserve">/ 18G, swap 2G, /home 4G</w:t>
+            </w:r>
+          </w:p>
+        </w:tc>
+        <w:tc>
+          <w:tcPr/>
+          <w:p>
+            <w:pPr>
+              <w:pStyle w:val="Compact"/>
+            </w:pPr>
+            <w:r>
+              <w:t xml:space="preserve">Пояснити розміщення завантажувача</w:t>
+            </w:r>
+          </w:p>
+        </w:tc>
+      </w:tr>
+      <w:tr>
+        <w:tc>
+          <w:tcPr/>
+          <w:p>
+            <w:pPr>
+              <w:pStyle w:val="Compact"/>
+            </w:pPr>
+            <w:r>
+              <w:t xml:space="preserve">13</w:t>
+            </w:r>
+          </w:p>
+        </w:tc>
+        <w:tc>
+          <w:tcPr/>
+          <w:p>
+            <w:pPr>
+              <w:pStyle w:val="Compact"/>
+            </w:pPr>
+            <w:r>
+              <w:t xml:space="preserve">Ubuntu, UEFI</w:t>
+            </w:r>
+          </w:p>
+        </w:tc>
+        <w:tc>
+          <w:tcPr/>
+          <w:p>
+            <w:pPr>
+              <w:pStyle w:val="Compact"/>
+            </w:pPr>
+            <w:r>
+              <w:t xml:space="preserve">ESP 512M, / 20G, без swap</w:t>
+            </w:r>
+          </w:p>
+        </w:tc>
+        <w:tc>
+          <w:tcPr/>
+          <w:p>
+            <w:pPr>
+              <w:pStyle w:val="Compact"/>
+            </w:pPr>
+            <w:r>
+              <w:t xml:space="preserve">Налаштувати файл підкачки замість розділу</w:t>
+            </w:r>
+          </w:p>
+        </w:tc>
+      </w:tr>
+      <w:tr>
+        <w:tc>
+          <w:tcPr/>
+          <w:p>
+            <w:pPr>
+              <w:pStyle w:val="Compact"/>
+            </w:pPr>
+            <w:r>
+              <w:t xml:space="preserve">14</w:t>
+            </w:r>
+          </w:p>
+        </w:tc>
+        <w:tc>
+          <w:tcPr/>
+          <w:p>
+            <w:pPr>
+              <w:pStyle w:val="Compact"/>
+            </w:pPr>
+            <w:r>
+              <w:t xml:space="preserve">Ubuntu Server, UEFI</w:t>
+            </w:r>
+          </w:p>
+        </w:tc>
+        <w:tc>
+          <w:tcPr/>
+          <w:p>
+            <w:pPr>
+              <w:pStyle w:val="Compact"/>
+            </w:pPr>
+            <w:r>
+              <w:t xml:space="preserve">ESP 512M, / 12G, /srv 10G, swap 2G</w:t>
+            </w:r>
+          </w:p>
+        </w:tc>
+        <w:tc>
+          <w:tcPr/>
+          <w:p>
+            <w:pPr>
+              <w:pStyle w:val="Compact"/>
+            </w:pPr>
+            <w:r>
+              <w:t xml:space="preserve">Описати призначення /srv</w:t>
+            </w:r>
+          </w:p>
+        </w:tc>
+      </w:tr>
+      <w:tr>
+        <w:tc>
+          <w:tcPr/>
+          <w:p>
+            <w:pPr>
+              <w:pStyle w:val="Compact"/>
+            </w:pPr>
+            <w:r>
+              <w:t xml:space="preserve">15</w:t>
+            </w:r>
+          </w:p>
+        </w:tc>
+        <w:tc>
+          <w:tcPr/>
+          <w:p>
+            <w:pPr>
+              <w:pStyle w:val="Compact"/>
+            </w:pPr>
+            <w:r>
+              <w:t xml:space="preserve">Ubuntu, UEFI, шифрування</w:t>
+            </w:r>
+          </w:p>
+        </w:tc>
+        <w:tc>
+          <w:tcPr/>
+          <w:p>
+            <w:pPr>
+              <w:pStyle w:val="Compact"/>
+            </w:pPr>
+            <w:r>
+              <w:t xml:space="preserve">ESP 512M, шифрований / 20G, swap 2G</w:t>
+            </w:r>
+          </w:p>
+        </w:tc>
+        <w:tc>
+          <w:tcPr/>
+          <w:p>
+            <w:pPr>
+              <w:pStyle w:val="Compact"/>
+            </w:pPr>
+            <w:r>
+              <w:t xml:space="preserve">Пояснити, що питає система при старті</w:t>
+            </w:r>
+          </w:p>
+        </w:tc>
+      </w:tr>
+      <w:tr>
+        <w:tc>
+          <w:tcPr/>
+          <w:p>
+            <w:pPr>
+              <w:pStyle w:val="Compact"/>
+            </w:pPr>
+            <w:r>
+              <w:t xml:space="preserve">16</w:t>
+            </w:r>
+          </w:p>
+        </w:tc>
+        <w:tc>
+          <w:tcPr/>
+          <w:p>
+            <w:pPr>
+              <w:pStyle w:val="Compact"/>
+            </w:pPr>
+            <w:r>
+              <w:t xml:space="preserve">Linux Mint, UEFI</w:t>
+            </w:r>
+          </w:p>
+        </w:tc>
+        <w:tc>
+          <w:tcPr/>
+          <w:p>
+            <w:pPr>
+              <w:pStyle w:val="Compact"/>
+            </w:pPr>
+            <w:r>
+              <w:t xml:space="preserve">ESP 512M, / 15G, /home решта</w:t>
+            </w:r>
+          </w:p>
+        </w:tc>
+        <w:tc>
+          <w:tcPr/>
+          <w:p>
+            <w:pPr>
+              <w:pStyle w:val="Compact"/>
+            </w:pPr>
+            <w:r>
+              <w:t xml:space="preserve">Порівняти інсталятор з Ubuntu</w:t>
+            </w:r>
+          </w:p>
+        </w:tc>
+      </w:tr>
+      <w:tr>
+        <w:tc>
+          <w:tcPr/>
+          <w:p>
+            <w:pPr>
+              <w:pStyle w:val="Compact"/>
+            </w:pPr>
+            <w:r>
+              <w:t xml:space="preserve">17</w:t>
+            </w:r>
+          </w:p>
+        </w:tc>
+        <w:tc>
+          <w:tcPr/>
+          <w:p>
+            <w:pPr>
+              <w:pStyle w:val="Compact"/>
+            </w:pPr>
+            <w:r>
+              <w:t xml:space="preserve">Ubuntu, UEFI, два диски</w:t>
+            </w:r>
+          </w:p>
+        </w:tc>
+        <w:tc>
+          <w:tcPr/>
+          <w:p>
+            <w:pPr>
+              <w:pStyle w:val="Compact"/>
+            </w:pPr>
+            <w:r>
+              <w:t xml:space="preserve">диск 1: система, диск 2: /home</w:t>
+            </w:r>
+          </w:p>
+        </w:tc>
+        <w:tc>
+          <w:tcPr/>
+          <w:p>
+            <w:pPr>
+              <w:pStyle w:val="Compact"/>
+            </w:pPr>
+            <w:r>
+              <w:t xml:space="preserve">Описати запис у /etc/fstab</w:t>
+            </w:r>
+          </w:p>
+        </w:tc>
+      </w:tr>
+      <w:tr>
+        <w:tc>
+          <w:tcPr/>
+          <w:p>
+            <w:pPr>
+              <w:pStyle w:val="Compact"/>
+            </w:pPr>
+            <w:r>
+              <w:t xml:space="preserve">18</w:t>
+            </w:r>
+          </w:p>
+        </w:tc>
+        <w:tc>
+          <w:tcPr/>
+          <w:p>
+            <w:pPr>
+              <w:pStyle w:val="Compact"/>
+            </w:pPr>
+            <w:r>
+              <w:t xml:space="preserve">Ubuntu, UEFI</w:t>
+            </w:r>
+          </w:p>
+        </w:tc>
+        <w:tc>
+          <w:tcPr/>
+          <w:p>
+            <w:pPr>
+              <w:pStyle w:val="Compact"/>
+            </w:pPr>
+            <w:r>
+              <w:t xml:space="preserve">ESP 512M, / 20G, swap 4G</w:t>
+            </w:r>
+          </w:p>
+        </w:tc>
+        <w:tc>
+          <w:tcPr/>
+          <w:p>
+            <w:pPr>
+              <w:pStyle w:val="Compact"/>
+            </w:pPr>
+            <w:r>
+              <w:t xml:space="preserve">Перевірити, скільки swap реально зайнято</w:t>
+            </w:r>
+          </w:p>
+        </w:tc>
+      </w:tr>
+      <w:tr>
+        <w:tc>
+          <w:tcPr/>
+          <w:p>
+            <w:pPr>
+              <w:pStyle w:val="Compact"/>
+            </w:pPr>
+            <w:r>
+              <w:t xml:space="preserve">19</w:t>
+            </w:r>
+          </w:p>
+        </w:tc>
+        <w:tc>
+          <w:tcPr/>
+          <w:p>
+            <w:pPr>
+              <w:pStyle w:val="Compact"/>
+            </w:pPr>
+            <w:r>
+              <w:t xml:space="preserve">Debian, UEFI, мінімальна</w:t>
+            </w:r>
+          </w:p>
+        </w:tc>
+        <w:tc>
+          <w:tcPr/>
+          <w:p>
+            <w:pPr>
+              <w:pStyle w:val="Compact"/>
+            </w:pPr>
+            <w:r>
+              <w:t xml:space="preserve">ESP 512M, / 10G, swap 1G</w:t>
+            </w:r>
+          </w:p>
+        </w:tc>
+        <w:tc>
+          <w:tcPr/>
+          <w:p>
+            <w:pPr>
+              <w:pStyle w:val="Compact"/>
+            </w:pPr>
+            <w:r>
+              <w:t xml:space="preserve">Виміряти обсяг зайнятого місця після інсталяції</w:t>
+            </w:r>
+          </w:p>
+        </w:tc>
+      </w:tr>
+      <w:tr>
+        <w:tc>
+          <w:tcPr/>
+          <w:p>
+            <w:pPr>
+              <w:pStyle w:val="Compact"/>
+            </w:pPr>
+            <w:r>
+              <w:t xml:space="preserve">20</w:t>
+            </w:r>
+          </w:p>
+        </w:tc>
+        <w:tc>
+          <w:tcPr/>
+          <w:p>
+            <w:pPr>
+              <w:pStyle w:val="Compact"/>
+            </w:pPr>
+            <w:r>
+              <w:t xml:space="preserve">Ubuntu, UEFI</w:t>
+            </w:r>
+          </w:p>
+        </w:tc>
+        <w:tc>
+          <w:tcPr/>
+          <w:p>
+            <w:pPr>
+              <w:pStyle w:val="Compact"/>
+            </w:pPr>
+            <w:r>
+              <w:t xml:space="preserve">ESP 512M, / 15G, /home 8G, swap 2G</w:t>
+            </w:r>
+          </w:p>
+        </w:tc>
+        <w:tc>
+          <w:tcPr/>
+          <w:p>
+            <w:pPr>
+              <w:pStyle w:val="Compact"/>
+            </w:pPr>
+            <w:r>
+              <w:t xml:space="preserve">Змінити назву комп’ютера після інсталяції</w:t>
+            </w:r>
+          </w:p>
+        </w:tc>
+      </w:tr>
+    </w:tbl>
+    <w:bookmarkEnd w:id="23"/>
+    <w:bookmarkStart w:id="27" w:name="контрольні-запитання"/>
+    <w:p>
+      <w:pPr>
+        <w:pStyle w:val="Heading2"/>
+      </w:pPr>
+      <w:r>
+        <w:t xml:space="preserve">Контрольні запитання</w:t>
+      </w:r>
+    </w:p>
+    <w:p>
+      <w:pPr>
+        <w:pStyle w:val="FirstParagraph"/>
+      </w:pPr>
+      <w:r>
+        <w:t xml:space="preserve">Запитання згруповано за рівнями навчальних досягнень. Для позитивної оцінки студент має відповісти на запитання середнього рівня, оцінка «добре» потребує відповідей достатнього рівня, оцінка «відмінно» — високого.</w:t>
+      </w:r>
+    </w:p>
+    <w:bookmarkStart w:id="24" w:name="середній-рівень-репродуктивний"/>
+    <w:p>
+      <w:pPr>
+        <w:pStyle w:val="Heading3"/>
+      </w:pPr>
+      <w:r>
+        <w:t xml:space="preserve">Середній рівень (репродуктивний)</w:t>
+      </w:r>
+    </w:p>
+    <w:p>
+      <w:pPr>
+        <w:pStyle w:val="Compact"/>
+        <w:numPr>
+          <w:ilvl w:val="0"/>
+          <w:numId w:val="1004"/>
+        </w:numPr>
+        <w:jc w:val="both"/>
+      </w:pPr>
+      <w:r>
+        <w:t xml:space="preserve">Чим схема UEFI + GPT відрізняється від BIOS + MBR?</w:t>
+      </w:r>
+    </w:p>
+    <w:p>
+      <w:pPr>
+        <w:pStyle w:val="Compact"/>
+        <w:numPr>
+          <w:ilvl w:val="0"/>
+          <w:numId w:val="1004"/>
+        </w:numPr>
+        <w:jc w:val="both"/>
+      </w:pPr>
+      <w:r>
+        <w:t xml:space="preserve">Яка файлова система має бути на розділі EFI і чому саме вона?</w:t>
+      </w:r>
+    </w:p>
+    <w:p>
+      <w:pPr>
+        <w:pStyle w:val="Compact"/>
+        <w:numPr>
+          <w:ilvl w:val="0"/>
+          <w:numId w:val="1004"/>
+        </w:numPr>
+        <w:jc w:val="both"/>
+      </w:pPr>
+      <w:r>
+        <w:t xml:space="preserve">Скільки основних розділів допускає таблиця MBR?</w:t>
+      </w:r>
+    </w:p>
+    <w:p>
+      <w:pPr>
+        <w:pStyle w:val="Compact"/>
+        <w:numPr>
+          <w:ilvl w:val="0"/>
+          <w:numId w:val="1004"/>
+        </w:numPr>
+        <w:jc w:val="both"/>
+      </w:pPr>
+      <w:r>
+        <w:t xml:space="preserve">Які чотири розділи входять до типової схеми розмітки Linux?</w:t>
+      </w:r>
+    </w:p>
+    <w:p>
+      <w:pPr>
+        <w:pStyle w:val="Compact"/>
+        <w:numPr>
+          <w:ilvl w:val="0"/>
+          <w:numId w:val="1004"/>
+        </w:numPr>
+        <w:jc w:val="both"/>
+      </w:pPr>
+      <w:r>
+        <w:t xml:space="preserve">Для чого призначений розділ підкачки?</w:t>
+      </w:r>
+    </w:p>
+    <w:p>
+      <w:pPr>
+        <w:pStyle w:val="Compact"/>
+        <w:numPr>
+          <w:ilvl w:val="0"/>
+          <w:numId w:val="1004"/>
+        </w:numPr>
+        <w:jc w:val="both"/>
+      </w:pPr>
+      <w:r>
+        <w:t xml:space="preserve">Якою командою перевірити перелік розділів і точки монтування?</w:t>
+      </w:r>
+    </w:p>
+    <w:p>
+      <w:pPr>
+        <w:pStyle w:val="Compact"/>
+        <w:numPr>
+          <w:ilvl w:val="0"/>
+          <w:numId w:val="1004"/>
+        </w:numPr>
+        <w:jc w:val="both"/>
+      </w:pPr>
+      <w:r>
+        <w:t xml:space="preserve">Як визначити, у якому режимі завантажено систему?</w:t>
+      </w:r>
+    </w:p>
+    <w:p>
+      <w:pPr>
+        <w:pStyle w:val="Compact"/>
+        <w:numPr>
+          <w:ilvl w:val="0"/>
+          <w:numId w:val="1004"/>
+        </w:numPr>
+        <w:jc w:val="both"/>
+      </w:pPr>
+      <w:r>
+        <w:t xml:space="preserve">Які дії входять до первинного налаштування системи?</w:t>
+      </w:r>
+    </w:p>
+    <w:bookmarkEnd w:id="24"/>
+    <w:bookmarkStart w:id="25" w:name="Xf8a59b0220f3a7cb520922cfcf2989f7f66f7c3"/>
+    <w:p>
+      <w:pPr>
+        <w:pStyle w:val="Heading3"/>
+      </w:pPr>
+      <w:r>
+        <w:t xml:space="preserve">Достатній рівень (конструктивно-варіативний)</w:t>
+      </w:r>
+    </w:p>
+    <w:p>
+      <w:pPr>
+        <w:pStyle w:val="Compact"/>
+        <w:numPr>
+          <w:ilvl w:val="0"/>
+          <w:numId w:val="1005"/>
+        </w:numPr>
+        <w:jc w:val="both"/>
+      </w:pPr>
+      <w:r>
+        <w:t xml:space="preserve">Навіщо виносити</w:t>
+      </w:r>
+      <w:r>
+        <w:t xml:space="preserve"> </w:t>
+      </w:r>
+      <w:r>
+        <w:rPr>
+          <w:rStyle w:val="VerbatimChar"/>
+        </w:rPr>
+        <w:t xml:space="preserve">/home</w:t>
+      </w:r>
+      <w:r>
+        <w:t xml:space="preserve"> </w:t>
+      </w:r>
+      <w:r>
+        <w:t xml:space="preserve">на окремий розділ і в чому недолік такого рішення?</w:t>
+      </w:r>
+    </w:p>
+    <w:p>
+      <w:pPr>
+        <w:pStyle w:val="Compact"/>
+        <w:numPr>
+          <w:ilvl w:val="0"/>
+          <w:numId w:val="1005"/>
+        </w:numPr>
+        <w:jc w:val="both"/>
+      </w:pPr>
+      <w:r>
+        <w:t xml:space="preserve">Чому система, установлена в режимі Legacy на диск GPT, може не завантажитися?</w:t>
+      </w:r>
+    </w:p>
+    <w:p>
+      <w:pPr>
+        <w:pStyle w:val="Compact"/>
+        <w:numPr>
+          <w:ilvl w:val="0"/>
+          <w:numId w:val="1005"/>
+        </w:numPr>
+        <w:jc w:val="both"/>
+      </w:pPr>
+      <w:r>
+        <w:t xml:space="preserve">Що станеться, якщо після інсталяції не від’єднати інсталяційний образ?</w:t>
+      </w:r>
+    </w:p>
+    <w:p>
+      <w:pPr>
+        <w:pStyle w:val="Compact"/>
+        <w:numPr>
+          <w:ilvl w:val="0"/>
+          <w:numId w:val="1005"/>
+        </w:numPr>
+        <w:jc w:val="both"/>
+      </w:pPr>
+      <w:r>
+        <w:t xml:space="preserve">Чому розділ EFI має бути саме FAT32, а не ext4?</w:t>
+      </w:r>
+    </w:p>
+    <w:p>
+      <w:pPr>
+        <w:pStyle w:val="Compact"/>
+        <w:numPr>
+          <w:ilvl w:val="0"/>
+          <w:numId w:val="1005"/>
+        </w:numPr>
+        <w:jc w:val="both"/>
+      </w:pPr>
+      <w:r>
+        <w:t xml:space="preserve">Поясніть, чому таблиця GPT зберігає резервну копію в кінці диска.</w:t>
+      </w:r>
+    </w:p>
+    <w:p>
+      <w:pPr>
+        <w:pStyle w:val="Compact"/>
+        <w:numPr>
+          <w:ilvl w:val="0"/>
+          <w:numId w:val="1005"/>
+        </w:numPr>
+        <w:jc w:val="both"/>
+      </w:pPr>
+      <w:r>
+        <w:t xml:space="preserve">Коли файл підкачки зручніший за окремий розділ підкачки?</w:t>
+      </w:r>
+    </w:p>
+    <w:p>
+      <w:pPr>
+        <w:pStyle w:val="Compact"/>
+        <w:numPr>
+          <w:ilvl w:val="0"/>
+          <w:numId w:val="1005"/>
+        </w:numPr>
+        <w:jc w:val="both"/>
+      </w:pPr>
+      <w:r>
+        <w:t xml:space="preserve">Чим автоматична розмітка зручна і чим небезпечна?</w:t>
+      </w:r>
+    </w:p>
+    <w:p>
+      <w:pPr>
+        <w:pStyle w:val="Compact"/>
+        <w:numPr>
+          <w:ilvl w:val="0"/>
+          <w:numId w:val="1005"/>
+        </w:numPr>
+        <w:jc w:val="both"/>
+      </w:pPr>
+      <w:r>
+        <w:t xml:space="preserve">Навіщо створювати знімок стану віртуальної машини одразу після інсталяції?</w:t>
+      </w:r>
+    </w:p>
+    <w:bookmarkEnd w:id="25"/>
+    <w:bookmarkStart w:id="26" w:name="високий-рівень-творчий"/>
+    <w:p>
+      <w:pPr>
+        <w:pStyle w:val="Heading3"/>
+      </w:pPr>
+      <w:r>
+        <w:t xml:space="preserve">Високий рівень (творчий)</w:t>
+      </w:r>
+    </w:p>
+    <w:p>
+      <w:pPr>
+        <w:pStyle w:val="Compact"/>
+        <w:numPr>
+          <w:ilvl w:val="0"/>
+          <w:numId w:val="1006"/>
+        </w:numPr>
+        <w:jc w:val="both"/>
+      </w:pPr>
+      <w:r>
+        <w:t xml:space="preserve">Спроєктуйте розмітку диска 100 ГБ для навчального комп’ютера, з якого</w:t>
+      </w:r>
+      <w:r>
+        <w:t xml:space="preserve"> </w:t>
+      </w:r>
+      <w:r>
+        <w:t xml:space="preserve">щосеместру видаляють дані студентів, але зберігають систему та програми.</w:t>
+      </w:r>
+      <w:r>
+        <w:t xml:space="preserve"> </w:t>
+      </w:r>
+      <w:r>
+        <w:t xml:space="preserve">Обґрунтуйте кожен розділ.</w:t>
+      </w:r>
+    </w:p>
+    <w:p>
+      <w:pPr>
+        <w:pStyle w:val="Compact"/>
+        <w:numPr>
+          <w:ilvl w:val="0"/>
+          <w:numId w:val="1006"/>
+        </w:numPr>
+        <w:jc w:val="both"/>
+      </w:pPr>
+      <w:r>
+        <w:t xml:space="preserve">Поясніть, які саме перевірки виконує Secure Boot і чому наявність цієї</w:t>
+      </w:r>
+      <w:r>
+        <w:t xml:space="preserve"> </w:t>
+      </w:r>
+      <w:r>
+        <w:t xml:space="preserve">функції не робить систему захищеною сама собою.</w:t>
+      </w:r>
+    </w:p>
+    <w:p>
+      <w:pPr>
+        <w:pStyle w:val="Compact"/>
+        <w:numPr>
+          <w:ilvl w:val="0"/>
+          <w:numId w:val="1006"/>
+        </w:numPr>
+        <w:jc w:val="both"/>
+      </w:pPr>
+      <w:r>
+        <w:t xml:space="preserve">Користувач скаржиться: після інсталяції система завантажується лише з меню</w:t>
+      </w:r>
+      <w:r>
+        <w:t xml:space="preserve"> </w:t>
+      </w:r>
+      <w:r>
+        <w:t xml:space="preserve">вибору носія. Побудуйте послідовність діагностики й назвіть найімовірнішу</w:t>
+      </w:r>
+      <w:r>
+        <w:t xml:space="preserve"> </w:t>
+      </w:r>
+      <w:r>
+        <w:t xml:space="preserve">причину.</w:t>
+      </w:r>
+    </w:p>
+    <w:p>
+      <w:pPr>
+        <w:pStyle w:val="Compact"/>
+        <w:numPr>
+          <w:ilvl w:val="0"/>
+          <w:numId w:val="1006"/>
+        </w:numPr>
+        <w:jc w:val="both"/>
+      </w:pPr>
+      <w:r>
+        <w:t xml:space="preserve">Порівняйте встановлення системи на фізичний комп’ютер і у віртуальну машину</w:t>
+      </w:r>
+      <w:r>
+        <w:t xml:space="preserve"> </w:t>
+      </w:r>
+      <w:r>
+        <w:t xml:space="preserve">за чотирма критеріями: ризик, швидкість, можливість відкату, придатність до</w:t>
+      </w:r>
+      <w:r>
+        <w:t xml:space="preserve"> </w:t>
+      </w:r>
+      <w:r>
+        <w:t xml:space="preserve">навчання.</w:t>
+      </w:r>
+    </w:p>
+    <w:bookmarkEnd w:id="26"/>
+    <w:bookmarkEnd w:id="27"/>
     <w:sectPr>
       <w:pgSz w:h="16838" w:orient="portrait" w:w="11906"/>
       <w:pgMar w:bottom="1134" w:footer="708" w:gutter="0" w:header="708" w:left="1418" w:right="851" w:top="1134"/>
@@ -137,8 +3517,310 @@
       </w:pPr>
     </w:lvl>
   </w:abstractNum>
+  <w:abstractNum w:abstractNumId="991">
+    <w:nsid w:val="0000A991"/>
+    <w:multiLevelType w:val="multilevel"/>
+    <w:lvl w:ilvl="0">
+      <w:numFmt w:val="bullet"/>
+      <w:lvlText w:val="–"/>
+      <w:lvlJc w:val="left"/>
+      <w:pPr>
+        <w:ind w:left="1134" w:hanging="425"/>
+      </w:pPr>
+      <w:rPr/>
+    </w:lvl>
+    <w:lvl w:ilvl="1">
+      <w:numFmt w:val="bullet"/>
+      <w:lvlText w:val="–"/>
+      <w:lvlJc w:val="left"/>
+      <w:pPr>
+        <w:ind w:left="1701" w:hanging="425"/>
+      </w:pPr>
+      <w:rPr>
+        <w:rFonts w:ascii="Courier New" w:hAnsi="Courier New" w:cs="Courier New" w:hint="default"/>
+      </w:rPr>
+    </w:lvl>
+    <w:lvl w:ilvl="2">
+      <w:numFmt w:val="bullet"/>
+      <w:lvlText w:val="–"/>
+      <w:lvlJc w:val="left"/>
+      <w:pPr>
+        <w:ind w:left="2268" w:hanging="425"/>
+      </w:pPr>
+      <w:rPr/>
+    </w:lvl>
+    <w:lvl w:ilvl="3">
+      <w:numFmt w:val="bullet"/>
+      <w:lvlText w:val="–"/>
+      <w:lvlJc w:val="left"/>
+      <w:pPr>
+        <w:ind w:left="2835" w:hanging="425"/>
+      </w:pPr>
+      <w:rPr/>
+    </w:lvl>
+    <w:lvl w:ilvl="4">
+      <w:numFmt w:val="bullet"/>
+      <w:lvlText w:val="–"/>
+      <w:lvlJc w:val="left"/>
+      <w:pPr>
+        <w:ind w:left="3402" w:hanging="425"/>
+      </w:pPr>
+      <w:rPr>
+        <w:rFonts w:ascii="Courier New" w:hAnsi="Courier New" w:cs="Courier New" w:hint="default"/>
+      </w:rPr>
+    </w:lvl>
+    <w:lvl w:ilvl="5">
+      <w:numFmt w:val="bullet"/>
+      <w:lvlText w:val="–"/>
+      <w:lvlJc w:val="left"/>
+      <w:pPr>
+        <w:ind w:left="3969" w:hanging="425"/>
+      </w:pPr>
+      <w:rPr/>
+    </w:lvl>
+    <w:lvl w:ilvl="6">
+      <w:numFmt w:val="bullet"/>
+      <w:lvlText w:val="–"/>
+      <w:lvlJc w:val="left"/>
+      <w:pPr>
+        <w:ind w:left="4536" w:hanging="425"/>
+      </w:pPr>
+      <w:rPr/>
+    </w:lvl>
+    <w:lvl w:ilvl="7">
+      <w:numFmt w:val="bullet"/>
+      <w:lvlText w:val="–"/>
+      <w:lvlJc w:val="left"/>
+      <w:pPr>
+        <w:ind w:left="5103" w:hanging="425"/>
+      </w:pPr>
+      <w:rPr>
+        <w:rFonts w:ascii="Courier New" w:hAnsi="Courier New" w:cs="Courier New" w:hint="default"/>
+      </w:rPr>
+    </w:lvl>
+    <w:lvl w:ilvl="8">
+      <w:numFmt w:val="bullet"/>
+      <w:lvlText w:val="–"/>
+      <w:lvlJc w:val="left"/>
+      <w:pPr>
+        <w:ind w:left="5670" w:hanging="425"/>
+      </w:pPr>
+      <w:rPr/>
+    </w:lvl>
+  </w:abstractNum>
+  <w:abstractNum w:abstractNumId="99411">
+    <w:nsid w:val="00A99411"/>
+    <w:multiLevelType w:val="multilevel"/>
+    <w:lvl w:ilvl="0">
+      <w:start w:val="1"/>
+      <w:numFmt w:val="decimal"/>
+      <w:lvlText w:val="%1."/>
+      <w:lvlJc w:val="left"/>
+      <w:pPr>
+        <w:ind w:left="1134" w:hanging="425"/>
+      </w:pPr>
+    </w:lvl>
+    <w:lvl w:ilvl="1">
+      <w:start w:val="1"/>
+      <w:numFmt w:val="decimal"/>
+      <w:lvlText w:val="%2."/>
+      <w:lvlJc w:val="left"/>
+      <w:pPr>
+        <w:ind w:left="1701" w:hanging="425"/>
+      </w:pPr>
+    </w:lvl>
+    <w:lvl w:ilvl="2">
+      <w:start w:val="1"/>
+      <w:numFmt w:val="decimal"/>
+      <w:lvlText w:val="%3."/>
+      <w:lvlJc w:val="left"/>
+      <w:pPr>
+        <w:ind w:left="2268" w:hanging="425"/>
+      </w:pPr>
+    </w:lvl>
+    <w:lvl w:ilvl="3">
+      <w:start w:val="1"/>
+      <w:numFmt w:val="decimal"/>
+      <w:lvlText w:val="%4."/>
+      <w:lvlJc w:val="left"/>
+      <w:pPr>
+        <w:ind w:left="2835" w:hanging="425"/>
+      </w:pPr>
+    </w:lvl>
+    <w:lvl w:ilvl="4">
+      <w:start w:val="1"/>
+      <w:numFmt w:val="decimal"/>
+      <w:lvlText w:val="%5."/>
+      <w:lvlJc w:val="left"/>
+      <w:pPr>
+        <w:ind w:left="3402" w:hanging="425"/>
+      </w:pPr>
+    </w:lvl>
+    <w:lvl w:ilvl="5">
+      <w:start w:val="1"/>
+      <w:numFmt w:val="decimal"/>
+      <w:lvlText w:val="%6."/>
+      <w:lvlJc w:val="left"/>
+      <w:pPr>
+        <w:ind w:left="3969" w:hanging="425"/>
+      </w:pPr>
+    </w:lvl>
+    <w:lvl w:ilvl="6">
+      <w:start w:val="1"/>
+      <w:numFmt w:val="decimal"/>
+      <w:lvlText w:val="%7."/>
+      <w:lvlJc w:val="left"/>
+      <w:pPr>
+        <w:ind w:left="4536" w:hanging="425"/>
+      </w:pPr>
+    </w:lvl>
+    <w:lvl w:ilvl="7">
+      <w:start w:val="1"/>
+      <w:numFmt w:val="decimal"/>
+      <w:lvlText w:val="%8."/>
+      <w:lvlJc w:val="left"/>
+      <w:pPr>
+        <w:ind w:left="5103" w:hanging="425"/>
+      </w:pPr>
+    </w:lvl>
+    <w:lvl w:ilvl="8">
+      <w:start w:val="1"/>
+      <w:numFmt w:val="decimal"/>
+      <w:lvlText w:val="%9."/>
+      <w:lvlJc w:val="left"/>
+      <w:pPr>
+        <w:ind w:left="5670" w:hanging="425"/>
+      </w:pPr>
+    </w:lvl>
+  </w:abstractNum>
   <w:num w:numId="1000">
     <w:abstractNumId w:val="990"/>
+  </w:num>
+  <w:num w:numId="1001">
+    <w:abstractNumId w:val="991"/>
+  </w:num>
+  <w:num w:numId="1002">
+    <w:abstractNumId w:val="99411"/>
+    <w:lvlOverride w:ilvl="0">
+      <w:startOverride w:val="1"/>
+    </w:lvlOverride>
+    <w:lvlOverride w:ilvl="1">
+      <w:startOverride w:val="1"/>
+    </w:lvlOverride>
+    <w:lvlOverride w:ilvl="2">
+      <w:startOverride w:val="1"/>
+    </w:lvlOverride>
+    <w:lvlOverride w:ilvl="3">
+      <w:startOverride w:val="1"/>
+    </w:lvlOverride>
+    <w:lvlOverride w:ilvl="4">
+      <w:startOverride w:val="1"/>
+    </w:lvlOverride>
+    <w:lvlOverride w:ilvl="5">
+      <w:startOverride w:val="1"/>
+    </w:lvlOverride>
+    <w:lvlOverride w:ilvl="6">
+      <w:startOverride w:val="1"/>
+    </w:lvlOverride>
+    <w:lvlOverride w:ilvl="7">
+      <w:startOverride w:val="1"/>
+    </w:lvlOverride>
+    <w:lvlOverride w:ilvl="8">
+      <w:startOverride w:val="1"/>
+    </w:lvlOverride>
+  </w:num>
+  <w:num w:numId="1003">
+    <w:abstractNumId w:val="991"/>
+  </w:num>
+  <w:num w:numId="1004">
+    <w:abstractNumId w:val="99411"/>
+    <w:lvlOverride w:ilvl="0">
+      <w:startOverride w:val="1"/>
+    </w:lvlOverride>
+    <w:lvlOverride w:ilvl="1">
+      <w:startOverride w:val="1"/>
+    </w:lvlOverride>
+    <w:lvlOverride w:ilvl="2">
+      <w:startOverride w:val="1"/>
+    </w:lvlOverride>
+    <w:lvlOverride w:ilvl="3">
+      <w:startOverride w:val="1"/>
+    </w:lvlOverride>
+    <w:lvlOverride w:ilvl="4">
+      <w:startOverride w:val="1"/>
+    </w:lvlOverride>
+    <w:lvlOverride w:ilvl="5">
+      <w:startOverride w:val="1"/>
+    </w:lvlOverride>
+    <w:lvlOverride w:ilvl="6">
+      <w:startOverride w:val="1"/>
+    </w:lvlOverride>
+    <w:lvlOverride w:ilvl="7">
+      <w:startOverride w:val="1"/>
+    </w:lvlOverride>
+    <w:lvlOverride w:ilvl="8">
+      <w:startOverride w:val="1"/>
+    </w:lvlOverride>
+  </w:num>
+  <w:num w:numId="1005">
+    <w:abstractNumId w:val="99411"/>
+    <w:lvlOverride w:ilvl="0">
+      <w:startOverride w:val="1"/>
+    </w:lvlOverride>
+    <w:lvlOverride w:ilvl="1">
+      <w:startOverride w:val="1"/>
+    </w:lvlOverride>
+    <w:lvlOverride w:ilvl="2">
+      <w:startOverride w:val="1"/>
+    </w:lvlOverride>
+    <w:lvlOverride w:ilvl="3">
+      <w:startOverride w:val="1"/>
+    </w:lvlOverride>
+    <w:lvlOverride w:ilvl="4">
+      <w:startOverride w:val="1"/>
+    </w:lvlOverride>
+    <w:lvlOverride w:ilvl="5">
+      <w:startOverride w:val="1"/>
+    </w:lvlOverride>
+    <w:lvlOverride w:ilvl="6">
+      <w:startOverride w:val="1"/>
+    </w:lvlOverride>
+    <w:lvlOverride w:ilvl="7">
+      <w:startOverride w:val="1"/>
+    </w:lvlOverride>
+    <w:lvlOverride w:ilvl="8">
+      <w:startOverride w:val="1"/>
+    </w:lvlOverride>
+  </w:num>
+  <w:num w:numId="1006">
+    <w:abstractNumId w:val="99411"/>
+    <w:lvlOverride w:ilvl="0">
+      <w:startOverride w:val="1"/>
+    </w:lvlOverride>
+    <w:lvlOverride w:ilvl="1">
+      <w:startOverride w:val="1"/>
+    </w:lvlOverride>
+    <w:lvlOverride w:ilvl="2">
+      <w:startOverride w:val="1"/>
+    </w:lvlOverride>
+    <w:lvlOverride w:ilvl="3">
+      <w:startOverride w:val="1"/>
+    </w:lvlOverride>
+    <w:lvlOverride w:ilvl="4">
+      <w:startOverride w:val="1"/>
+    </w:lvlOverride>
+    <w:lvlOverride w:ilvl="5">
+      <w:startOverride w:val="1"/>
+    </w:lvlOverride>
+    <w:lvlOverride w:ilvl="6">
+      <w:startOverride w:val="1"/>
+    </w:lvlOverride>
+    <w:lvlOverride w:ilvl="7">
+      <w:startOverride w:val="1"/>
+    </w:lvlOverride>
+    <w:lvlOverride w:ilvl="8">
+      <w:startOverride w:val="1"/>
+    </w:lvlOverride>
   </w:num>
 </w:numbering>
 </file>
@@ -849,6 +4531,11 @@
       <w:sz w:val="18"/>
       <w:szCs w:val="18"/>
     </w:rPr>
+  </w:style>
+  <w:style w:type="paragraph" w:customStyle="1" w:styleId="TableCaption">
+    <w:name w:val="TableCaption"/>
+    <w:basedOn w:val="BodyText"/>
+    <w:qFormat/>
   </w:style>
 </w:styles>
 </file>

</xml_diff>